<commit_message>
Ajout du pipeline PUDC avec sortie du rapport personnalisé
</commit_message>
<xml_diff>
--- a/PUDC_Pipeline/data/output/QAQC_Report.docx
+++ b/PUDC_Pipeline/data/output/QAQC_Report.docx
@@ -15,7 +15,7 @@
         <w:pStyle w:val="Date"/>
       </w:pPr>
       <w:r>
-        <w:t xml:space="preserve">13 juillet 2026</w:t>
+        <w:t xml:space="preserve">15 juillet 2026</w:t>
       </w:r>
     </w:p>
     <w:sdt>
@@ -151,16 +151,174 @@
       </w:r>
     </w:p>
     <w:bookmarkEnd w:id="9"/>
-    <w:bookmarkStart w:id="19" w:name="X47a5980c5f2a0573d1a10756999e7bd38f7d050"/>
+    <w:bookmarkStart w:id="10" w:name="synthèse-exécutive"/>
     <w:p>
       <w:pPr>
         <w:pStyle w:val="Heading2"/>
       </w:pPr>
       <w:r>
+        <w:t xml:space="preserve">Synthèse Exécutive</w:t>
+      </w:r>
+    </w:p>
+    <w:p>
+      <w:pPr>
+        <w:pStyle w:val="FirstParagraph"/>
+      </w:pPr>
+      <w:r>
+        <w:t xml:space="preserve">Le présent rapport documente le traitement, la validation (QAQC) et les analyses descriptives de l’enquête PUDC (Programme d’Urgence de Développement Communautaire, Sénégal rural). Les principaux enseignements sont les suivants :</w:t>
+      </w:r>
+    </w:p>
+    <w:p>
+      <w:pPr>
+        <w:pStyle w:val="Compact"/>
+        <w:numPr>
+          <w:ilvl w:val="0"/>
+          <w:numId w:val="1001"/>
+        </w:numPr>
+      </w:pPr>
+      <w:r>
+        <w:rPr>
+          <w:b/>
+          <w:bCs/>
+        </w:rPr>
+        <w:t xml:space="preserve">Ménages et individus enquêtés</w:t>
+      </w:r>
+      <w:r>
+        <w:t xml:space="preserve"> </w:t>
+      </w:r>
+      <w:r>
+        <w:t xml:space="preserve">: 1686 ménages et 14609 individus.</w:t>
+      </w:r>
+    </w:p>
+    <w:p>
+      <w:pPr>
+        <w:pStyle w:val="Compact"/>
+        <w:numPr>
+          <w:ilvl w:val="0"/>
+          <w:numId w:val="1001"/>
+        </w:numPr>
+      </w:pPr>
+      <w:r>
+        <w:rPr>
+          <w:b/>
+          <w:bCs/>
+        </w:rPr>
+        <w:t xml:space="preserve">Accès à l’eau potable améliorée (standard JMP)</w:t>
+      </w:r>
+      <w:r>
+        <w:t xml:space="preserve"> </w:t>
+      </w:r>
+      <w:r>
+        <w:t xml:space="preserve">: 47,3 %.</w:t>
+      </w:r>
+    </w:p>
+    <w:p>
+      <w:pPr>
+        <w:pStyle w:val="Compact"/>
+        <w:numPr>
+          <w:ilvl w:val="0"/>
+          <w:numId w:val="1001"/>
+        </w:numPr>
+      </w:pPr>
+      <w:r>
+        <w:rPr>
+          <w:b/>
+          <w:bCs/>
+        </w:rPr>
+        <w:t xml:space="preserve">Index de richesse (ACP, poolé MICE)</w:t>
+      </w:r>
+      <w:r>
+        <w:t xml:space="preserve"> </w:t>
+      </w:r>
+      <w:r>
+        <w:t xml:space="preserve">: moyenne centrée 0,00, écart-type 1,45.</w:t>
+      </w:r>
+    </w:p>
+    <w:p>
+      <w:pPr>
+        <w:pStyle w:val="Compact"/>
+        <w:numPr>
+          <w:ilvl w:val="0"/>
+          <w:numId w:val="1001"/>
+        </w:numPr>
+      </w:pPr>
+      <w:r>
+        <w:rPr>
+          <w:b/>
+          <w:bCs/>
+        </w:rPr>
+        <w:t xml:space="preserve">Ménages ayant subi au moins un choc</w:t>
+      </w:r>
+      <w:r>
+        <w:t xml:space="preserve"> </w:t>
+      </w:r>
+      <w:r>
+        <w:t xml:space="preserve">: 50,1 %.</w:t>
+      </w:r>
+    </w:p>
+    <w:p>
+      <w:pPr>
+        <w:pStyle w:val="Compact"/>
+        <w:numPr>
+          <w:ilvl w:val="0"/>
+          <w:numId w:val="1001"/>
+        </w:numPr>
+      </w:pPr>
+      <w:r>
+        <w:rPr>
+          <w:b/>
+          <w:bCs/>
+        </w:rPr>
+        <w:t xml:space="preserve">Malnutrition aiguë (déclaration d’œdèmes, 6-59 mois)</w:t>
+      </w:r>
+      <w:r>
+        <w:t xml:space="preserve"> </w:t>
+      </w:r>
+      <w:r>
+        <w:t xml:space="preserve">: 1,75 %.</w:t>
+      </w:r>
+    </w:p>
+    <w:p>
+      <w:pPr>
+        <w:pStyle w:val="Compact"/>
+        <w:numPr>
+          <w:ilvl w:val="0"/>
+          <w:numId w:val="1001"/>
+        </w:numPr>
+      </w:pPr>
+      <w:r>
+        <w:rPr>
+          <w:b/>
+          <w:bCs/>
+        </w:rPr>
+        <w:t xml:space="preserve">Ménages orphelins</w:t>
+      </w:r>
+      <w:r>
+        <w:t xml:space="preserve"> </w:t>
+      </w:r>
+      <w:r>
+        <w:t xml:space="preserve">(sans chef déclaré dans le roster) : 91 (5,4 %).</w:t>
+      </w:r>
+    </w:p>
+    <w:p>
+      <w:pPr>
+        <w:pStyle w:val="FirstParagraph"/>
+      </w:pPr>
+      <w:r>
+        <w:t xml:space="preserve">Le rapport détaille ensuite le diagnostic des données manquantes, l’imputation MICE, les profils démographiques et de logement, puis les cartographies régionales.</w:t>
+      </w:r>
+    </w:p>
+    <w:bookmarkEnd w:id="10"/>
+    <w:bookmarkStart w:id="20" w:name="X47a5980c5f2a0573d1a10756999e7bd38f7d050"/>
+    <w:p>
+      <w:pPr>
+        <w:pStyle w:val="Heading2"/>
+      </w:pPr>
+      <w:r>
         <w:t xml:space="preserve">2. Section A : Statistiques Descriptives Détaillées</w:t>
       </w:r>
     </w:p>
-    <w:bookmarkStart w:id="18" w:name="Xe6c21ac9c3276431bf99449a6ed427060a014bd"/>
+    <w:bookmarkStart w:id="19" w:name="Xe6c21ac9c3276431bf99449a6ed427060a014bd"/>
     <w:p>
       <w:pPr>
         <w:pStyle w:val="Heading3"/>
@@ -177,7 +335,7 @@
         <w:t xml:space="preserve">Le Sénégal est divisé en plusieurs régions. En couplant nos données avec les limites administratives (shapefile GADM), nous pouvons visualiser spatialement les disparités régionales.</w:t>
       </w:r>
     </w:p>
-    <w:bookmarkStart w:id="13" w:name="X4d73829866befb30fd33885367244d191ed2107"/>
+    <w:bookmarkStart w:id="14" w:name="X4d73829866befb30fd33885367244d191ed2107"/>
     <w:p>
       <w:pPr>
         <w:pStyle w:val="Heading4"/>
@@ -195,18 +353,18 @@
           <wp:inline>
             <wp:extent cx="5334000" cy="3556000"/>
             <wp:effectExtent b="0" l="0" r="0" t="0"/>
-            <wp:docPr descr="" title="" id="11" name="Picture"/>
+            <wp:docPr descr="" title="" id="12" name="Picture"/>
             <a:graphic>
               <a:graphicData uri="http://schemas.openxmlformats.org/drawingml/2006/picture">
                 <pic:pic>
                   <pic:nvPicPr>
-                    <pic:cNvPr descr="C:\Users\USER\Documents\ENSAE\ISE3\traitements des données statistiques\Projet_Traitement_Analyse\PUDC_Pipeline\data\output\QAQC_Report_files/43e540bf1a07834a2ef7b786d4630c835debd197.png" id="12" name="Picture"/>
+                    <pic:cNvPr descr="C:\Users\USER\Documents\ENSAE\ISE3\traitements des données statistiques\Projet_Traitement_Analyse\PUDC_Pipeline\data\output\QAQC_Report_files/a7529354e171062c6ec65c1cefd4acbdcd31135e.png" id="13" name="Picture"/>
                     <pic:cNvPicPr>
                       <a:picLocks noChangeArrowheads="1" noChangeAspect="1"/>
                     </pic:cNvPicPr>
                   </pic:nvPicPr>
                   <pic:blipFill>
-                    <a:blip r:embed="rId10"/>
+                    <a:blip r:embed="rId11"/>
                     <a:stretch>
                       <a:fillRect/>
                     </a:stretch>
@@ -233,8 +391,8 @@
         </w:drawing>
       </w:r>
     </w:p>
-    <w:bookmarkEnd w:id="13"/>
-    <w:bookmarkStart w:id="17" w:name="X8f297381fef14241340eee6459ccd2fd56b20b9"/>
+    <w:bookmarkEnd w:id="14"/>
+    <w:bookmarkStart w:id="18" w:name="X8f297381fef14241340eee6459ccd2fd56b20b9"/>
     <w:p>
       <w:pPr>
         <w:pStyle w:val="Heading4"/>
@@ -252,18 +410,18 @@
           <wp:inline>
             <wp:extent cx="5334000" cy="3556000"/>
             <wp:effectExtent b="0" l="0" r="0" t="0"/>
-            <wp:docPr descr="" title="" id="15" name="Picture"/>
+            <wp:docPr descr="" title="" id="16" name="Picture"/>
             <a:graphic>
               <a:graphicData uri="http://schemas.openxmlformats.org/drawingml/2006/picture">
                 <pic:pic>
                   <pic:nvPicPr>
-                    <pic:cNvPr descr="C:\Users\USER\Documents\ENSAE\ISE3\traitements des données statistiques\Projet_Traitement_Analyse\PUDC_Pipeline\data\output\QAQC_Report_files/565d80424ed16ba63b5fcf5cdb1fd3655d2a23ea.png" id="16" name="Picture"/>
+                    <pic:cNvPr descr="C:\Users\USER\Documents\ENSAE\ISE3\traitements des données statistiques\Projet_Traitement_Analyse\PUDC_Pipeline\data\output\QAQC_Report_files/e67ec30cda684b7772ef583d82ee22ed54bcaf1e.png" id="17" name="Picture"/>
                     <pic:cNvPicPr>
                       <a:picLocks noChangeArrowheads="1" noChangeAspect="1"/>
                     </pic:cNvPicPr>
                   </pic:nvPicPr>
                   <pic:blipFill>
-                    <a:blip r:embed="rId14"/>
+                    <a:blip r:embed="rId15"/>
                     <a:stretch>
                       <a:fillRect/>
                     </a:stretch>
@@ -468,7 +626,7 @@
               <w:jc w:val="right"/>
             </w:pPr>
             <w:r>
-              <w:t xml:space="preserve">-0.28</w:t>
+              <w:t xml:space="preserve">-0.24</w:t>
             </w:r>
           </w:p>
         </w:tc>
@@ -542,7 +700,7 @@
               <w:jc w:val="right"/>
             </w:pPr>
             <w:r>
-              <w:t xml:space="preserve">-0.55</w:t>
+              <w:t xml:space="preserve">0.67</w:t>
             </w:r>
           </w:p>
         </w:tc>
@@ -616,7 +774,7 @@
               <w:jc w:val="right"/>
             </w:pPr>
             <w:r>
-              <w:t xml:space="preserve">0.12</w:t>
+              <w:t xml:space="preserve">0.08</w:t>
             </w:r>
           </w:p>
         </w:tc>
@@ -690,7 +848,7 @@
               <w:jc w:val="right"/>
             </w:pPr>
             <w:r>
-              <w:t xml:space="preserve">0.26</w:t>
+              <w:t xml:space="preserve">0.09</w:t>
             </w:r>
           </w:p>
         </w:tc>
@@ -764,7 +922,7 @@
               <w:jc w:val="right"/>
             </w:pPr>
             <w:r>
-              <w:t xml:space="preserve">-0.17</w:t>
+              <w:t xml:space="preserve">-0.14</w:t>
             </w:r>
           </w:p>
         </w:tc>
@@ -838,7 +996,7 @@
               <w:jc w:val="right"/>
             </w:pPr>
             <w:r>
-              <w:t xml:space="preserve">0.56</w:t>
+              <w:t xml:space="preserve">0.63</w:t>
             </w:r>
           </w:p>
         </w:tc>
@@ -912,7 +1070,7 @@
               <w:jc w:val="right"/>
             </w:pPr>
             <w:r>
-              <w:t xml:space="preserve">1.59</w:t>
+              <w:t xml:space="preserve">1.75</w:t>
             </w:r>
           </w:p>
         </w:tc>
@@ -986,7 +1144,7 @@
               <w:jc w:val="right"/>
             </w:pPr>
             <w:r>
-              <w:t xml:space="preserve">3.08</w:t>
+              <w:t xml:space="preserve">3.75</w:t>
             </w:r>
           </w:p>
         </w:tc>
@@ -1060,7 +1218,7 @@
               <w:jc w:val="right"/>
             </w:pPr>
             <w:r>
-              <w:t xml:space="preserve">-0.82</w:t>
+              <w:t xml:space="preserve">1.07</w:t>
             </w:r>
           </w:p>
         </w:tc>
@@ -1134,7 +1292,7 @@
               <w:jc w:val="right"/>
             </w:pPr>
             <w:r>
-              <w:t xml:space="preserve">0.98</w:t>
+              <w:t xml:space="preserve">0.78</w:t>
             </w:r>
           </w:p>
         </w:tc>
@@ -1282,7 +1440,7 @@
               <w:jc w:val="right"/>
             </w:pPr>
             <w:r>
-              <w:t xml:space="preserve">0.88</w:t>
+              <w:t xml:space="preserve">0.99</w:t>
             </w:r>
           </w:p>
         </w:tc>
@@ -1430,7 +1588,7 @@
               <w:jc w:val="right"/>
             </w:pPr>
             <w:r>
-              <w:t xml:space="preserve">-0.31</w:t>
+              <w:t xml:space="preserve">0.85</w:t>
             </w:r>
           </w:p>
         </w:tc>
@@ -1504,7 +1662,7 @@
               <w:jc w:val="right"/>
             </w:pPr>
             <w:r>
-              <w:t xml:space="preserve">-0.70</w:t>
+              <w:t xml:space="preserve">-0.69</w:t>
             </w:r>
           </w:p>
         </w:tc>
@@ -1578,7 +1736,7 @@
               <w:jc w:val="right"/>
             </w:pPr>
             <w:r>
-              <w:t xml:space="preserve">1.03</w:t>
+              <w:t xml:space="preserve">0.76</w:t>
             </w:r>
           </w:p>
         </w:tc>
@@ -1652,7 +1810,7 @@
               <w:jc w:val="right"/>
             </w:pPr>
             <w:r>
-              <w:t xml:space="preserve">0.07</w:t>
+              <w:t xml:space="preserve">0.06</w:t>
             </w:r>
           </w:p>
         </w:tc>
@@ -1726,7 +1884,7 @@
               <w:jc w:val="right"/>
             </w:pPr>
             <w:r>
-              <w:t xml:space="preserve">0.78</w:t>
+              <w:t xml:space="preserve">0.86</w:t>
             </w:r>
           </w:p>
         </w:tc>
@@ -1874,7 +2032,7 @@
               <w:jc w:val="right"/>
             </w:pPr>
             <w:r>
-              <w:t xml:space="preserve">-0.70</w:t>
+              <w:t xml:space="preserve">-0.71</w:t>
             </w:r>
           </w:p>
         </w:tc>
@@ -1948,7 +2106,7 @@
               <w:jc w:val="right"/>
             </w:pPr>
             <w:r>
-              <w:t xml:space="preserve">-0.27</w:t>
+              <w:t xml:space="preserve">-0.35</w:t>
             </w:r>
           </w:p>
         </w:tc>
@@ -2022,7 +2180,7 @@
               <w:jc w:val="right"/>
             </w:pPr>
             <w:r>
-              <w:t xml:space="preserve">0.36</w:t>
+              <w:t xml:space="preserve">0.42</w:t>
             </w:r>
           </w:p>
         </w:tc>
@@ -2096,7 +2254,7 @@
               <w:jc w:val="right"/>
             </w:pPr>
             <w:r>
-              <w:t xml:space="preserve">2.56</w:t>
+              <w:t xml:space="preserve">1.97</w:t>
             </w:r>
           </w:p>
         </w:tc>
@@ -2170,7 +2328,7 @@
               <w:jc w:val="right"/>
             </w:pPr>
             <w:r>
-              <w:t xml:space="preserve">-0.86</w:t>
+              <w:t xml:space="preserve">-0.85</w:t>
             </w:r>
           </w:p>
         </w:tc>
@@ -2244,7 +2402,7 @@
               <w:jc w:val="right"/>
             </w:pPr>
             <w:r>
-              <w:t xml:space="preserve">0.11</w:t>
+              <w:t xml:space="preserve">0.14</w:t>
             </w:r>
           </w:p>
         </w:tc>
@@ -2318,22 +2476,22 @@
               <w:jc w:val="right"/>
             </w:pPr>
             <w:r>
-              <w:t xml:space="preserve">6.36</w:t>
+              <w:t xml:space="preserve">3.52</w:t>
             </w:r>
           </w:p>
         </w:tc>
       </w:tr>
     </w:tbl>
-    <w:bookmarkEnd w:id="17"/>
     <w:bookmarkEnd w:id="18"/>
     <w:bookmarkEnd w:id="19"/>
-    <w:bookmarkStart w:id="29" w:name="X4f306251854ba36f09b44797fd3ded12d44b358"/>
+    <w:bookmarkEnd w:id="20"/>
+    <w:bookmarkStart w:id="30" w:name="X23e0f7d33c35f0c3f5b1234248b847e6f17d6e2"/>
     <w:p>
       <w:pPr>
         <w:pStyle w:val="Heading2"/>
       </w:pPr>
       <w:r>
-        <w:t xml:space="preserve">2b. Diagnostic et mécanisme des données manquantes (cours 4-5)</w:t>
+        <w:t xml:space="preserve">2b. Diagnostic et mécanisme des données manquantes</w:t>
       </w:r>
     </w:p>
     <w:p>
@@ -2341,7 +2499,7 @@
         <w:pStyle w:val="FirstParagraph"/>
       </w:pPr>
       <w:r>
-        <w:t xml:space="preserve">Le pipeline diagnostique la complétude et le mécanisme des données manquantes avant toute imputation (cours 4 : non-réponse ; cours 5 : MCAR/MAR/MNAR). Les actifs manquants sont imputés par MICE (méthode</w:t>
+        <w:t xml:space="preserve">Le pipeline diagnostique la complétude et le mécanisme des données manquantes avant toute imputation (non-réponse ; MCAR/MAR/MNAR). Les actifs manquants sont imputés par MICE (méthode</w:t>
       </w:r>
       <w:r>
         <w:t xml:space="preserve"> </w:t>
@@ -2376,7 +2534,7 @@
         <w:t xml:space="preserve">## **Conclusion sur le mécanisme :** Les données des actifs présentent un mécanisme **MCAR** (Missing Completely At Random) . Le MUAC quant à lui est un **MNAR** structurel.</w:t>
       </w:r>
     </w:p>
-    <w:bookmarkStart w:id="28" w:name="X8901b9a7580abf8457ad48fd57aaae0d13aa423"/>
+    <w:bookmarkStart w:id="29" w:name="X8901b9a7580abf8457ad48fd57aaae0d13aa423"/>
     <w:p>
       <w:pPr>
         <w:pStyle w:val="Heading3"/>
@@ -2385,7 +2543,7 @@
         <w:t xml:space="preserve">Visualisation de la distribution et du mécanisme des données manquantes</w:t>
       </w:r>
     </w:p>
-    <w:bookmarkStart w:id="23" w:name="comparaison-avant-après-imputation-mice"/>
+    <w:bookmarkStart w:id="24" w:name="comparaison-avant-après-imputation-mice"/>
     <w:p>
       <w:pPr>
         <w:pStyle w:val="Heading4"/>
@@ -2403,18 +2561,18 @@
           <wp:inline>
             <wp:extent cx="5334000" cy="2667000"/>
             <wp:effectExtent b="0" l="0" r="0" t="0"/>
-            <wp:docPr descr="" title="" id="21" name="Picture"/>
+            <wp:docPr descr="" title="" id="22" name="Picture"/>
             <a:graphic>
               <a:graphicData uri="http://schemas.openxmlformats.org/drawingml/2006/picture">
                 <pic:pic>
                   <pic:nvPicPr>
-                    <pic:cNvPr descr="C:\Users\USER\Documents\ENSAE\ISE3\traitements des données statistiques\Projet_Traitement_Analyse\PUDC_Pipeline\data\output\QAQC_Report_files/0d0c93bb2f62024a4098e183e8cc92795031c0e9.png" id="22" name="Picture"/>
+                    <pic:cNvPr descr="C:\Users\USER\Documents\ENSAE\ISE3\traitements des données statistiques\Projet_Traitement_Analyse\PUDC_Pipeline\data\output\QAQC_Report_files/e27f86bbc7b0fd9cd2faf92f4dba588a08eec996.png" id="23" name="Picture"/>
                     <pic:cNvPicPr>
                       <a:picLocks noChangeArrowheads="1" noChangeAspect="1"/>
                     </pic:cNvPicPr>
                   </pic:nvPicPr>
                   <pic:blipFill>
-                    <a:blip r:embed="rId20"/>
+                    <a:blip r:embed="rId21"/>
                     <a:stretch>
                       <a:fillRect/>
                     </a:stretch>
@@ -2441,8 +2599,8 @@
         </w:drawing>
       </w:r>
     </w:p>
-    <w:bookmarkEnd w:id="23"/>
-    <w:bookmarkStart w:id="27" w:name="X7c86cc1a047b0fc7daa1ea04760650bddbfdfdc"/>
+    <w:bookmarkEnd w:id="24"/>
+    <w:bookmarkStart w:id="28" w:name="X7c86cc1a047b0fc7daa1ea04760650bddbfdfdc"/>
     <w:p>
       <w:pPr>
         <w:pStyle w:val="Heading4"/>
@@ -2460,18 +2618,18 @@
           <wp:inline>
             <wp:extent cx="5334000" cy="3556000"/>
             <wp:effectExtent b="0" l="0" r="0" t="0"/>
-            <wp:docPr descr="" title="" id="25" name="Picture"/>
+            <wp:docPr descr="" title="" id="26" name="Picture"/>
             <a:graphic>
               <a:graphicData uri="http://schemas.openxmlformats.org/drawingml/2006/picture">
                 <pic:pic>
                   <pic:nvPicPr>
-                    <pic:cNvPr descr="C:\Users\USER\Documents\ENSAE\ISE3\traitements des données statistiques\Projet_Traitement_Analyse\PUDC_Pipeline\data\output\QAQC_Report_files/263753d446868ef5c7c46c2f90addb8a7d90cad4.png" id="26" name="Picture"/>
+                    <pic:cNvPr descr="C:\Users\USER\Documents\ENSAE\ISE3\traitements des données statistiques\Projet_Traitement_Analyse\PUDC_Pipeline\data\output\QAQC_Report_files/65d3265255784b04e4605f2656fdda6a55a2dc66.png" id="27" name="Picture"/>
                     <pic:cNvPicPr>
                       <a:picLocks noChangeArrowheads="1" noChangeAspect="1"/>
                     </pic:cNvPicPr>
                   </pic:nvPicPr>
                   <pic:blipFill>
-                    <a:blip r:embed="rId24"/>
+                    <a:blip r:embed="rId25"/>
                     <a:stretch>
                       <a:fillRect/>
                     </a:stretch>
@@ -2498,79 +2656,175 @@
         </w:drawing>
       </w:r>
     </w:p>
-    <w:bookmarkEnd w:id="27"/>
     <w:bookmarkEnd w:id="28"/>
     <w:bookmarkEnd w:id="29"/>
-    <w:bookmarkStart w:id="34" w:name="X48aeec49abc0cd24a89558b81da34e7666a033d"/>
+    <w:bookmarkEnd w:id="30"/>
+    <w:bookmarkStart w:id="35" w:name="structure-démographique-de-la-population"/>
     <w:p>
       <w:pPr>
         <w:pStyle w:val="Heading2"/>
       </w:pPr>
       <w:r>
-        <w:t xml:space="preserve">2c. Exploration de l’imputation par K-Plus Proches Voisins (KNN) (Cours 3)</w:t>
+        <w:t xml:space="preserve">3. Structure Démographique de la Population</w:t>
+      </w:r>
+    </w:p>
+    <w:p>
+      <w:pPr>
+        <w:pStyle w:val="TableCaption"/>
+      </w:pPr>
+      <w:r>
+        <w:t xml:space="preserve">Caractéristiques démographiques</w:t>
+      </w:r>
+    </w:p>
+    <w:tbl>
+      <w:tblPr>
+        <w:tblStyle w:val="Table"/>
+        <w:tblW w:type="auto" w:w="0"/>
+        <w:tblLook w:firstRow="1" w:lastRow="0" w:firstColumn="0" w:lastColumn="0" w:noHBand="0" w:noVBand="0" w:val="0020"/>
+        <w:tblCaption w:val="Caractéristiques démographiques"/>
+      </w:tblPr>
+      <w:tblGrid>
+        <w:gridCol w:w="3960"/>
+        <w:gridCol w:w="3960"/>
+      </w:tblGrid>
+      <w:tr>
+        <w:trPr>
+          <w:tblHeader w:val="on"/>
+        </w:trPr>
+        <w:tc>
+          <w:tcPr/>
+          <w:p>
+            <w:pPr>
+              <w:pStyle w:val="Compact"/>
+              <w:jc w:val="left"/>
+            </w:pPr>
+            <w:r>
+              <w:t xml:space="preserve">Indicateur</w:t>
+            </w:r>
+          </w:p>
+        </w:tc>
+        <w:tc>
+          <w:tcPr/>
+          <w:p>
+            <w:pPr>
+              <w:pStyle w:val="Compact"/>
+              <w:jc w:val="left"/>
+            </w:pPr>
+            <w:r>
+              <w:t xml:space="preserve">Valeur</w:t>
+            </w:r>
+          </w:p>
+        </w:tc>
+      </w:tr>
+      <w:tr>
+        <w:tc>
+          <w:tcPr/>
+          <w:p>
+            <w:pPr>
+              <w:pStyle w:val="Compact"/>
+              <w:jc w:val="left"/>
+            </w:pPr>
+            <w:r>
+              <w:t xml:space="preserve">Proportion de femmes</w:t>
+            </w:r>
+          </w:p>
+        </w:tc>
+        <w:tc>
+          <w:tcPr/>
+          <w:p>
+            <w:pPr>
+              <w:pStyle w:val="Compact"/>
+              <w:jc w:val="left"/>
+            </w:pPr>
+            <w:r>
+              <w:t xml:space="preserve">51.08%</w:t>
+            </w:r>
+          </w:p>
+        </w:tc>
+      </w:tr>
+      <w:tr>
+        <w:tc>
+          <w:tcPr/>
+          <w:p>
+            <w:pPr>
+              <w:pStyle w:val="Compact"/>
+              <w:jc w:val="left"/>
+            </w:pPr>
+            <w:r>
+              <w:t xml:space="preserve">Âge moyen des membres</w:t>
+            </w:r>
+          </w:p>
+        </w:tc>
+        <w:tc>
+          <w:tcPr/>
+          <w:p>
+            <w:pPr>
+              <w:pStyle w:val="Compact"/>
+              <w:jc w:val="left"/>
+            </w:pPr>
+            <w:r>
+              <w:t xml:space="preserve">23.06 ans</w:t>
+            </w:r>
+          </w:p>
+        </w:tc>
+      </w:tr>
+      <w:tr>
+        <w:tc>
+          <w:tcPr/>
+          <w:p>
+            <w:pPr>
+              <w:pStyle w:val="Compact"/>
+              <w:jc w:val="left"/>
+            </w:pPr>
+            <w:r>
+              <w:t xml:space="preserve">Proportion d’enfants (&lt; 5 ans)</w:t>
+            </w:r>
+          </w:p>
+        </w:tc>
+        <w:tc>
+          <w:tcPr/>
+          <w:p>
+            <w:pPr>
+              <w:pStyle w:val="Compact"/>
+              <w:jc w:val="left"/>
+            </w:pPr>
+            <w:r>
+              <w:t xml:space="preserve">11.27%</w:t>
+            </w:r>
+          </w:p>
+        </w:tc>
+      </w:tr>
+    </w:tbl>
+    <w:bookmarkStart w:id="34" w:name="répartition-par-âge-et-sexe"/>
+    <w:p>
+      <w:pPr>
+        <w:pStyle w:val="Heading3"/>
+      </w:pPr>
+      <w:r>
+        <w:t xml:space="preserve">Répartition par âge et sexe</w:t>
       </w:r>
     </w:p>
     <w:p>
       <w:pPr>
         <w:pStyle w:val="FirstParagraph"/>
-      </w:pPr>
-      <w:r>
-        <w:t xml:space="preserve">À titre comparatif avec la méthode MICE utilisée en production, nous simulons la recherche du paramètre optimal</w:t>
-      </w:r>
-      <w:r>
-        <w:t xml:space="preserve"> </w:t>
-      </w:r>
-      <m:oMath>
-        <m:r>
-          <m:t>K</m:t>
-        </m:r>
-      </m:oMath>
-      <w:r>
-        <w:t xml:space="preserve"> </w:t>
-      </w:r>
-      <w:r>
-        <w:t xml:space="preserve">pour une imputation KNN. L’objectif est d’imputer la possession du bien 1 (</w:t>
-      </w:r>
-      <w:r>
-        <w:rPr>
-          <w:rStyle w:val="VerbatimChar"/>
-        </w:rPr>
-        <w:t xml:space="preserve">Y2</w:t>
-      </w:r>
-      <w:r>
-        <w:t xml:space="preserve">) à l’aide de la taille du ménage et de la possession du bien 2 (</w:t>
-      </w:r>
-      <w:r>
-        <w:rPr>
-          <w:rStyle w:val="VerbatimChar"/>
-        </w:rPr>
-        <w:t xml:space="preserve">X1</w:t>
-      </w:r>
-      <w:r>
-        <w:t xml:space="preserve">).</w:t>
-      </w:r>
-    </w:p>
-    <w:p>
-      <w:pPr>
-        <w:pStyle w:val="BodyText"/>
       </w:pPr>
       <w:r>
         <w:drawing>
           <wp:inline>
             <wp:extent cx="5334000" cy="3333750"/>
             <wp:effectExtent b="0" l="0" r="0" t="0"/>
-            <wp:docPr descr="" title="" id="31" name="Picture"/>
+            <wp:docPr descr="" title="" id="32" name="Picture"/>
             <a:graphic>
               <a:graphicData uri="http://schemas.openxmlformats.org/drawingml/2006/picture">
                 <pic:pic>
                   <pic:nvPicPr>
-                    <pic:cNvPr descr="C:\Users\USER\Documents\ENSAE\ISE3\traitements des données statistiques\Projet_Traitement_Analyse\PUDC_Pipeline\data\output\QAQC_Report_files/fead3111fa76b757389fc78bf9582daa4a194794.png" id="32" name="Picture"/>
+                    <pic:cNvPr descr="C:\Users\USER\Documents\ENSAE\ISE3\traitements des données statistiques\Projet_Traitement_Analyse\PUDC_Pipeline\data\output\QAQC_Report_files/dee2862384e0993fb0efbeacc595a253eee4c4ee.png" id="33" name="Picture"/>
                     <pic:cNvPicPr>
                       <a:picLocks noChangeArrowheads="1" noChangeAspect="1"/>
                     </pic:cNvPicPr>
                   </pic:nvPicPr>
                   <pic:blipFill>
-                    <a:blip r:embed="rId30"/>
+                    <a:blip r:embed="rId31"/>
                     <a:stretch>
                       <a:fillRect/>
                     </a:stretch>
@@ -2597,13 +2851,88 @@
         </w:drawing>
       </w:r>
     </w:p>
-    <w:bookmarkStart w:id="33" w:name="Xa1fb998acf1a92bbc65a7db27f2c9b5632cd076"/>
+    <w:bookmarkEnd w:id="34"/>
+    <w:bookmarkEnd w:id="35"/>
+    <w:bookmarkStart w:id="74" w:name="Xf061c28e976c1f344959c670032bcc83fdbc8eb"/>
+    <w:p>
+      <w:pPr>
+        <w:pStyle w:val="Heading2"/>
+      </w:pPr>
+      <w:r>
+        <w:t xml:space="preserve">4. Caractéristiques du Logement et Accès aux Services</w:t>
+      </w:r>
+    </w:p>
+    <w:bookmarkStart w:id="43" w:name="accès-à-leau-potable-standard-jmp"/>
+    <w:p>
+      <w:pPr>
+        <w:pStyle w:val="Heading3"/>
+      </w:pPr>
+      <w:r>
+        <w:t xml:space="preserve">Accès à l’Eau Potable (Standard JMP)</w:t>
+      </w:r>
+    </w:p>
+    <w:p>
+      <w:pPr>
+        <w:pStyle w:val="FirstParagraph"/>
+      </w:pPr>
+      <w:r>
+        <w:t xml:space="preserve">L’accès à une source d’eau potable améliorée a été recalculé conformément aux standards JMP de l’OMS/UNICEF.</w:t>
+      </w:r>
+    </w:p>
+    <w:p>
+      <w:pPr>
+        <w:pStyle w:val="BodyText"/>
+      </w:pPr>
+      <w:r>
+        <w:drawing>
+          <wp:inline>
+            <wp:extent cx="5334000" cy="3556000"/>
+            <wp:effectExtent b="0" l="0" r="0" t="0"/>
+            <wp:docPr descr="" title="" id="37" name="Picture"/>
+            <a:graphic>
+              <a:graphicData uri="http://schemas.openxmlformats.org/drawingml/2006/picture">
+                <pic:pic>
+                  <pic:nvPicPr>
+                    <pic:cNvPr descr="C:\Users\USER\Documents\ENSAE\ISE3\traitements des données statistiques\Projet_Traitement_Analyse\PUDC_Pipeline\data\output\QAQC_Report_files/761dd451da584994957eba6ebf22a739d20e4c92.png" id="38" name="Picture"/>
+                    <pic:cNvPicPr>
+                      <a:picLocks noChangeArrowheads="1" noChangeAspect="1"/>
+                    </pic:cNvPicPr>
+                  </pic:nvPicPr>
+                  <pic:blipFill>
+                    <a:blip r:embed="rId36"/>
+                    <a:stretch>
+                      <a:fillRect/>
+                    </a:stretch>
+                  </pic:blipFill>
+                  <pic:spPr bwMode="auto">
+                    <a:xfrm>
+                      <a:off x="0" y="0"/>
+                      <a:ext cx="5334000" cy="3556000"/>
+                    </a:xfrm>
+                    <a:prstGeom prst="rect">
+                      <a:avLst/>
+                    </a:prstGeom>
+                    <a:noFill/>
+                    <a:ln w="9525">
+                      <a:noFill/>
+                      <a:headEnd/>
+                      <a:tailEnd/>
+                    </a:ln>
+                  </pic:spPr>
+                </pic:pic>
+              </a:graphicData>
+            </a:graphic>
+          </wp:inline>
+        </w:drawing>
+      </w:r>
+    </w:p>
+    <w:bookmarkStart w:id="42" w:name="accès-à-lassainissement-amélioré"/>
     <w:p>
       <w:pPr>
         <w:pStyle w:val="Heading4"/>
       </w:pPr>
       <w:r>
-        <w:t xml:space="preserve">Exploration d’autres méthodes d’imputation (Régression et Random Forest)</w:t>
+        <w:t xml:space="preserve">Accès à l’Assainissement Amélioré</w:t>
       </w:r>
     </w:p>
     <w:p>
@@ -2611,22 +2940,7 @@
         <w:pStyle w:val="FirstParagraph"/>
       </w:pPr>
       <w:r>
-        <w:t xml:space="preserve">Pour démontrer la maîtrise des autres méthodes d’imputation vues au Cours 5, voici l’imputation de l’actif</w:t>
-      </w:r>
-      <w:r>
-        <w:t xml:space="preserve"> </w:t>
-      </w:r>
-      <w:r>
-        <w:rPr>
-          <w:rStyle w:val="VerbatimChar"/>
-        </w:rPr>
-        <w:t xml:space="preserve">Y2</w:t>
-      </w:r>
-      <w:r>
-        <w:t xml:space="preserve"> </w:t>
-      </w:r>
-      <w:r>
-        <w:t xml:space="preserve">par régression linéaire et Random Forest.</w:t>
+        <w:t xml:space="preserve">L’assainissement est mesuré par le type de toilettes utilisées par le ménage.</w:t>
       </w:r>
     </w:p>
     <w:p>
@@ -2634,7 +2948,7 @@
         <w:pStyle w:val="TableCaption"/>
       </w:pPr>
       <w:r>
-        <w:t xml:space="preserve">Comparaison de l’espérance de la possession d’actif selon la méthode</w:t>
+        <w:t xml:space="preserve">Distribution de l’accès à l’assainissement</w:t>
       </w:r>
     </w:p>
     <w:tbl>
@@ -2642,7 +2956,407 @@
         <w:tblStyle w:val="Table"/>
         <w:tblW w:type="auto" w:w="0"/>
         <w:tblLook w:firstRow="1" w:lastRow="0" w:firstColumn="0" w:lastColumn="0" w:noHBand="0" w:noVBand="0" w:val="0020"/>
-        <w:tblCaption w:val="Comparaison de l’espérance de la possession d’actif selon la méthode"/>
+        <w:tblCaption w:val="Distribution de l’accès à l’assainissement"/>
+      </w:tblPr>
+      <w:tblGrid>
+        <w:gridCol w:w="2640"/>
+        <w:gridCol w:w="2640"/>
+        <w:gridCol w:w="2640"/>
+      </w:tblGrid>
+      <w:tr>
+        <w:trPr>
+          <w:tblHeader w:val="on"/>
+        </w:trPr>
+        <w:tc>
+          <w:tcPr/>
+          <w:p>
+            <w:pPr>
+              <w:pStyle w:val="Compact"/>
+              <w:jc w:val="left"/>
+            </w:pPr>
+            <w:r>
+              <w:t xml:space="preserve">assainissement_ameliore</w:t>
+            </w:r>
+          </w:p>
+        </w:tc>
+        <w:tc>
+          <w:tcPr/>
+          <w:p>
+            <w:pPr>
+              <w:pStyle w:val="Compact"/>
+              <w:jc w:val="right"/>
+            </w:pPr>
+            <w:r>
+              <w:t xml:space="preserve">Effectif</w:t>
+            </w:r>
+          </w:p>
+        </w:tc>
+        <w:tc>
+          <w:tcPr/>
+          <w:p>
+            <w:pPr>
+              <w:pStyle w:val="Compact"/>
+              <w:jc w:val="right"/>
+            </w:pPr>
+            <w:r>
+              <w:t xml:space="preserve">Proportion</w:t>
+            </w:r>
+          </w:p>
+        </w:tc>
+      </w:tr>
+      <w:tr>
+        <w:tc>
+          <w:tcPr/>
+          <w:p>
+            <w:pPr>
+              <w:pStyle w:val="Compact"/>
+              <w:jc w:val="left"/>
+            </w:pPr>
+            <w:r>
+              <w:t xml:space="preserve">Amélioré</w:t>
+            </w:r>
+          </w:p>
+        </w:tc>
+        <w:tc>
+          <w:tcPr/>
+          <w:p>
+            <w:pPr>
+              <w:pStyle w:val="Compact"/>
+              <w:jc w:val="right"/>
+            </w:pPr>
+            <w:r>
+              <w:t xml:space="preserve">999</w:t>
+            </w:r>
+          </w:p>
+        </w:tc>
+        <w:tc>
+          <w:tcPr/>
+          <w:p>
+            <w:pPr>
+              <w:pStyle w:val="Compact"/>
+              <w:jc w:val="right"/>
+            </w:pPr>
+            <w:r>
+              <w:t xml:space="preserve">59.3</w:t>
+            </w:r>
+          </w:p>
+        </w:tc>
+      </w:tr>
+      <w:tr>
+        <w:tc>
+          <w:tcPr/>
+          <w:p>
+            <w:pPr>
+              <w:pStyle w:val="Compact"/>
+              <w:jc w:val="left"/>
+            </w:pPr>
+            <w:r>
+              <w:t xml:space="preserve">Non Amélioré</w:t>
+            </w:r>
+          </w:p>
+        </w:tc>
+        <w:tc>
+          <w:tcPr/>
+          <w:p>
+            <w:pPr>
+              <w:pStyle w:val="Compact"/>
+              <w:jc w:val="right"/>
+            </w:pPr>
+            <w:r>
+              <w:t xml:space="preserve">687</w:t>
+            </w:r>
+          </w:p>
+        </w:tc>
+        <w:tc>
+          <w:tcPr/>
+          <w:p>
+            <w:pPr>
+              <w:pStyle w:val="Compact"/>
+              <w:jc w:val="right"/>
+            </w:pPr>
+            <w:r>
+              <w:t xml:space="preserve">40.7</w:t>
+            </w:r>
+          </w:p>
+        </w:tc>
+      </w:tr>
+    </w:tbl>
+    <w:p>
+      <w:pPr>
+        <w:pStyle w:val="BodyText"/>
+      </w:pPr>
+      <w:r>
+        <w:drawing>
+          <wp:inline>
+            <wp:extent cx="5334000" cy="3556000"/>
+            <wp:effectExtent b="0" l="0" r="0" t="0"/>
+            <wp:docPr descr="" title="" id="40" name="Picture"/>
+            <a:graphic>
+              <a:graphicData uri="http://schemas.openxmlformats.org/drawingml/2006/picture">
+                <pic:pic>
+                  <pic:nvPicPr>
+                    <pic:cNvPr descr="C:\Users\USER\Documents\ENSAE\ISE3\traitements des données statistiques\Projet_Traitement_Analyse\PUDC_Pipeline\data\output\QAQC_Report_files/485cf71a2e4f2af675f38ab17099f33d33b1706b.png" id="41" name="Picture"/>
+                    <pic:cNvPicPr>
+                      <a:picLocks noChangeArrowheads="1" noChangeAspect="1"/>
+                    </pic:cNvPicPr>
+                  </pic:nvPicPr>
+                  <pic:blipFill>
+                    <a:blip r:embed="rId39"/>
+                    <a:stretch>
+                      <a:fillRect/>
+                    </a:stretch>
+                  </pic:blipFill>
+                  <pic:spPr bwMode="auto">
+                    <a:xfrm>
+                      <a:off x="0" y="0"/>
+                      <a:ext cx="5334000" cy="3556000"/>
+                    </a:xfrm>
+                    <a:prstGeom prst="rect">
+                      <a:avLst/>
+                    </a:prstGeom>
+                    <a:noFill/>
+                    <a:ln w="9525">
+                      <a:noFill/>
+                      <a:headEnd/>
+                      <a:tailEnd/>
+                    </a:ln>
+                  </pic:spPr>
+                </pic:pic>
+              </a:graphicData>
+            </a:graphic>
+          </wp:inline>
+        </w:drawing>
+      </w:r>
+    </w:p>
+    <w:bookmarkEnd w:id="42"/>
+    <w:bookmarkEnd w:id="43"/>
+    <w:bookmarkStart w:id="49" w:name="Xd6c59849d06dfb12dc45ff22cb76ce52d4ccd89"/>
+    <w:p>
+      <w:pPr>
+        <w:pStyle w:val="Heading3"/>
+      </w:pPr>
+      <w:r>
+        <w:t xml:space="preserve">Éducation et Caractéristiques du Chef de Ménage</w:t>
+      </w:r>
+    </w:p>
+    <w:bookmarkStart w:id="47" w:name="scolarisation-des-individus"/>
+    <w:p>
+      <w:pPr>
+        <w:pStyle w:val="Heading4"/>
+      </w:pPr>
+      <w:r>
+        <w:t xml:space="preserve">Scolarisation des individus</w:t>
+      </w:r>
+    </w:p>
+    <w:p>
+      <w:pPr>
+        <w:pStyle w:val="TableCaption"/>
+      </w:pPr>
+      <w:r>
+        <w:t xml:space="preserve">Taux de scolarisation par tranche d’âge scolaire</w:t>
+      </w:r>
+    </w:p>
+    <w:tbl>
+      <w:tblPr>
+        <w:tblStyle w:val="Table"/>
+        <w:tblW w:type="auto" w:w="0"/>
+        <w:tblLook w:firstRow="1" w:lastRow="0" w:firstColumn="0" w:lastColumn="0" w:noHBand="0" w:noVBand="0" w:val="0020"/>
+        <w:tblCaption w:val="Taux de scolarisation par tranche d’âge scolaire"/>
+      </w:tblPr>
+      <w:tblGrid>
+        <w:gridCol w:w="2640"/>
+        <w:gridCol w:w="2640"/>
+        <w:gridCol w:w="2640"/>
+      </w:tblGrid>
+      <w:tr>
+        <w:trPr>
+          <w:tblHeader w:val="on"/>
+        </w:trPr>
+        <w:tc>
+          <w:tcPr/>
+          <w:p>
+            <w:pPr>
+              <w:pStyle w:val="Compact"/>
+              <w:jc w:val="left"/>
+            </w:pPr>
+            <w:r>
+              <w:t xml:space="preserve">Tranche</w:t>
+            </w:r>
+          </w:p>
+        </w:tc>
+        <w:tc>
+          <w:tcPr/>
+          <w:p>
+            <w:pPr>
+              <w:pStyle w:val="Compact"/>
+              <w:jc w:val="right"/>
+            </w:pPr>
+            <w:r>
+              <w:t xml:space="preserve">Taux scolarisation (%)</w:t>
+            </w:r>
+          </w:p>
+        </w:tc>
+        <w:tc>
+          <w:tcPr/>
+          <w:p>
+            <w:pPr>
+              <w:pStyle w:val="Compact"/>
+              <w:jc w:val="right"/>
+            </w:pPr>
+            <w:r>
+              <w:t xml:space="preserve">Total</w:t>
+            </w:r>
+          </w:p>
+        </w:tc>
+      </w:tr>
+      <w:tr>
+        <w:tc>
+          <w:tcPr/>
+          <w:p>
+            <w:pPr>
+              <w:pStyle w:val="Compact"/>
+              <w:jc w:val="left"/>
+            </w:pPr>
+            <w:r>
+              <w:t xml:space="preserve">Moyen (12-15 ans)</w:t>
+            </w:r>
+          </w:p>
+        </w:tc>
+        <w:tc>
+          <w:tcPr/>
+          <w:p>
+            <w:pPr>
+              <w:pStyle w:val="Compact"/>
+              <w:jc w:val="right"/>
+            </w:pPr>
+            <w:r>
+              <w:t xml:space="preserve">69.9</w:t>
+            </w:r>
+          </w:p>
+        </w:tc>
+        <w:tc>
+          <w:tcPr/>
+          <w:p>
+            <w:pPr>
+              <w:pStyle w:val="Compact"/>
+              <w:jc w:val="right"/>
+            </w:pPr>
+            <w:r>
+              <w:t xml:space="preserve">1805</w:t>
+            </w:r>
+          </w:p>
+        </w:tc>
+      </w:tr>
+      <w:tr>
+        <w:tc>
+          <w:tcPr/>
+          <w:p>
+            <w:pPr>
+              <w:pStyle w:val="Compact"/>
+              <w:jc w:val="left"/>
+            </w:pPr>
+            <w:r>
+              <w:t xml:space="preserve">Primaire (6-11 ans)</w:t>
+            </w:r>
+          </w:p>
+        </w:tc>
+        <w:tc>
+          <w:tcPr/>
+          <w:p>
+            <w:pPr>
+              <w:pStyle w:val="Compact"/>
+              <w:jc w:val="right"/>
+            </w:pPr>
+            <w:r>
+              <w:t xml:space="preserve">52.3</w:t>
+            </w:r>
+          </w:p>
+        </w:tc>
+        <w:tc>
+          <w:tcPr/>
+          <w:p>
+            <w:pPr>
+              <w:pStyle w:val="Compact"/>
+              <w:jc w:val="right"/>
+            </w:pPr>
+            <w:r>
+              <w:t xml:space="preserve">3255</w:t>
+            </w:r>
+          </w:p>
+        </w:tc>
+      </w:tr>
+    </w:tbl>
+    <w:p>
+      <w:pPr>
+        <w:pStyle w:val="BodyText"/>
+      </w:pPr>
+      <w:r>
+        <w:drawing>
+          <wp:inline>
+            <wp:extent cx="5334000" cy="3556000"/>
+            <wp:effectExtent b="0" l="0" r="0" t="0"/>
+            <wp:docPr descr="" title="" id="45" name="Picture"/>
+            <a:graphic>
+              <a:graphicData uri="http://schemas.openxmlformats.org/drawingml/2006/picture">
+                <pic:pic>
+                  <pic:nvPicPr>
+                    <pic:cNvPr descr="C:\Users\USER\Documents\ENSAE\ISE3\traitements des données statistiques\Projet_Traitement_Analyse\PUDC_Pipeline\data\output\QAQC_Report_files/140e0b8a8b1315871134b823f20e53d9c7b912c7.png" id="46" name="Picture"/>
+                    <pic:cNvPicPr>
+                      <a:picLocks noChangeArrowheads="1" noChangeAspect="1"/>
+                    </pic:cNvPicPr>
+                  </pic:nvPicPr>
+                  <pic:blipFill>
+                    <a:blip r:embed="rId44"/>
+                    <a:stretch>
+                      <a:fillRect/>
+                    </a:stretch>
+                  </pic:blipFill>
+                  <pic:spPr bwMode="auto">
+                    <a:xfrm>
+                      <a:off x="0" y="0"/>
+                      <a:ext cx="5334000" cy="3556000"/>
+                    </a:xfrm>
+                    <a:prstGeom prst="rect">
+                      <a:avLst/>
+                    </a:prstGeom>
+                    <a:noFill/>
+                    <a:ln w="9525">
+                      <a:noFill/>
+                      <a:headEnd/>
+                      <a:tailEnd/>
+                    </a:ln>
+                  </pic:spPr>
+                </pic:pic>
+              </a:graphicData>
+            </a:graphic>
+          </wp:inline>
+        </w:drawing>
+      </w:r>
+    </w:p>
+    <w:bookmarkEnd w:id="47"/>
+    <w:bookmarkStart w:id="48" w:name="profil-du-chef-de-ménage"/>
+    <w:p>
+      <w:pPr>
+        <w:pStyle w:val="Heading4"/>
+      </w:pPr>
+      <w:r>
+        <w:t xml:space="preserve">Profil du Chef de Ménage</w:t>
+      </w:r>
+    </w:p>
+    <w:p>
+      <w:pPr>
+        <w:pStyle w:val="TableCaption"/>
+      </w:pPr>
+      <w:r>
+        <w:t xml:space="preserve">Profil sociodémographique des Chefs de Ménage</w:t>
+      </w:r>
+    </w:p>
+    <w:tbl>
+      <w:tblPr>
+        <w:tblStyle w:val="Table"/>
+        <w:tblW w:type="auto" w:w="0"/>
+        <w:tblLook w:firstRow="1" w:lastRow="0" w:firstColumn="0" w:lastColumn="0" w:noHBand="0" w:noVBand="0" w:val="0020"/>
+        <w:tblCaption w:val="Profil sociodémographique des Chefs de Ménage"/>
       </w:tblPr>
       <w:tblGrid>
         <w:gridCol w:w="3960"/>
@@ -2660,137 +3374,120 @@
               <w:jc w:val="left"/>
             </w:pPr>
             <w:r>
-              <w:t xml:space="preserve">Méthode</w:t>
-            </w:r>
-          </w:p>
-        </w:tc>
-        <w:tc>
-          <w:tcPr/>
-          <w:p>
-            <w:pPr>
-              <w:pStyle w:val="Compact"/>
-              <w:jc w:val="right"/>
-            </w:pPr>
-            <w:r>
-              <w:t xml:space="preserve">Moyenne_Y2</w:t>
-            </w:r>
-          </w:p>
-        </w:tc>
-      </w:tr>
-      <w:tr>
-        <w:tc>
-          <w:tcPr/>
-          <w:p>
-            <w:pPr>
-              <w:pStyle w:val="Compact"/>
-              <w:jc w:val="left"/>
-            </w:pPr>
-            <w:r>
-              <w:t xml:space="preserve">Brut (Moyenne)</w:t>
-            </w:r>
-          </w:p>
-        </w:tc>
-        <w:tc>
-          <w:tcPr/>
-          <w:p>
-            <w:pPr>
-              <w:pStyle w:val="Compact"/>
-              <w:jc w:val="right"/>
-            </w:pPr>
-            <w:r>
-              <w:t xml:space="preserve">0.0187852</w:t>
-            </w:r>
-          </w:p>
-        </w:tc>
-      </w:tr>
-      <w:tr>
-        <w:tc>
-          <w:tcPr/>
-          <w:p>
-            <w:pPr>
-              <w:pStyle w:val="Compact"/>
-              <w:jc w:val="left"/>
-            </w:pPr>
-            <w:r>
-              <w:t xml:space="preserve">MICE (Logreg poolé)</w:t>
-            </w:r>
-          </w:p>
-        </w:tc>
-        <w:tc>
-          <w:tcPr/>
-          <w:p>
-            <w:pPr>
-              <w:pStyle w:val="Compact"/>
-              <w:jc w:val="right"/>
-            </w:pPr>
-            <w:r>
-              <w:t xml:space="preserve">0.0187852</w:t>
-            </w:r>
-          </w:p>
-        </w:tc>
-      </w:tr>
-      <w:tr>
-        <w:tc>
-          <w:tcPr/>
-          <w:p>
-            <w:pPr>
-              <w:pStyle w:val="Compact"/>
-              <w:jc w:val="left"/>
-            </w:pPr>
-            <w:r>
-              <w:t xml:space="preserve">Régression Linéaire (lm)</w:t>
-            </w:r>
-          </w:p>
-        </w:tc>
-        <w:tc>
-          <w:tcPr/>
-          <w:p>
-            <w:pPr>
-              <w:pStyle w:val="Compact"/>
-              <w:jc w:val="right"/>
-            </w:pPr>
-            <w:r>
-              <w:t xml:space="preserve">0.0187852</w:t>
-            </w:r>
-          </w:p>
-        </w:tc>
-      </w:tr>
-      <w:tr>
-        <w:tc>
-          <w:tcPr/>
-          <w:p>
-            <w:pPr>
-              <w:pStyle w:val="Compact"/>
-              <w:jc w:val="left"/>
-            </w:pPr>
-            <w:r>
-              <w:t xml:space="preserve">Random Forest</w:t>
-            </w:r>
-          </w:p>
-        </w:tc>
-        <w:tc>
-          <w:tcPr/>
-          <w:p>
-            <w:pPr>
-              <w:pStyle w:val="Compact"/>
-              <w:jc w:val="right"/>
-            </w:pPr>
-            <w:r>
-              <w:t xml:space="preserve">0.0188434</w:t>
+              <w:t xml:space="preserve">Indicateur</w:t>
+            </w:r>
+          </w:p>
+        </w:tc>
+        <w:tc>
+          <w:tcPr/>
+          <w:p>
+            <w:pPr>
+              <w:pStyle w:val="Compact"/>
+              <w:jc w:val="right"/>
+            </w:pPr>
+            <w:r>
+              <w:t xml:space="preserve">Valeur</w:t>
+            </w:r>
+          </w:p>
+        </w:tc>
+      </w:tr>
+      <w:tr>
+        <w:tc>
+          <w:tcPr/>
+          <w:p>
+            <w:pPr>
+              <w:pStyle w:val="Compact"/>
+              <w:jc w:val="left"/>
+            </w:pPr>
+            <w:r>
+              <w:t xml:space="preserve">Âge moyen du Chef de Ménage</w:t>
+            </w:r>
+          </w:p>
+        </w:tc>
+        <w:tc>
+          <w:tcPr/>
+          <w:p>
+            <w:pPr>
+              <w:pStyle w:val="Compact"/>
+              <w:jc w:val="right"/>
+            </w:pPr>
+            <w:r>
+              <w:t xml:space="preserve">54.3</w:t>
+            </w:r>
+          </w:p>
+        </w:tc>
+      </w:tr>
+      <w:tr>
+        <w:tc>
+          <w:tcPr/>
+          <w:p>
+            <w:pPr>
+              <w:pStyle w:val="Compact"/>
+              <w:jc w:val="left"/>
+            </w:pPr>
+            <w:r>
+              <w:t xml:space="preserve">Proportion de femmes Chefs de Ménage (%)</w:t>
+            </w:r>
+          </w:p>
+        </w:tc>
+        <w:tc>
+          <w:tcPr/>
+          <w:p>
+            <w:pPr>
+              <w:pStyle w:val="Compact"/>
+              <w:jc w:val="right"/>
+            </w:pPr>
+            <w:r>
+              <w:t xml:space="preserve">17.0</w:t>
+            </w:r>
+          </w:p>
+        </w:tc>
+      </w:tr>
+      <w:tr>
+        <w:tc>
+          <w:tcPr/>
+          <w:p>
+            <w:pPr>
+              <w:pStyle w:val="Compact"/>
+              <w:jc w:val="left"/>
+            </w:pPr>
+            <w:r>
+              <w:t xml:space="preserve">Taux de scolarisation du Chef de Ménage (%)</w:t>
+            </w:r>
+          </w:p>
+        </w:tc>
+        <w:tc>
+          <w:tcPr/>
+          <w:p>
+            <w:pPr>
+              <w:pStyle w:val="Compact"/>
+              <w:jc w:val="right"/>
+            </w:pPr>
+            <w:r>
+              <w:t xml:space="preserve">25.5</w:t>
             </w:r>
           </w:p>
         </w:tc>
       </w:tr>
     </w:tbl>
-    <w:bookmarkEnd w:id="33"/>
-    <w:bookmarkEnd w:id="34"/>
-    <w:bookmarkStart w:id="39" w:name="structure-démographique-de-la-population"/>
-    <w:p>
-      <w:pPr>
-        <w:pStyle w:val="Heading2"/>
-      </w:pPr>
-      <w:r>
-        <w:t xml:space="preserve">3. Structure Démographique de la Population</w:t>
+    <w:bookmarkEnd w:id="48"/>
+    <w:bookmarkEnd w:id="49"/>
+    <w:bookmarkStart w:id="52" w:name="caractéristiques-du-logement-et-emploi"/>
+    <w:p>
+      <w:pPr>
+        <w:pStyle w:val="Heading3"/>
+      </w:pPr>
+      <w:r>
+        <w:t xml:space="preserve">Caractéristiques du Logement et Emploi</w:t>
+      </w:r>
+    </w:p>
+    <w:bookmarkStart w:id="50" w:name="matériaux-de-construction"/>
+    <w:p>
+      <w:pPr>
+        <w:pStyle w:val="Heading4"/>
+      </w:pPr>
+      <w:r>
+        <w:t xml:space="preserve">Matériaux de construction</w:t>
       </w:r>
     </w:p>
     <w:p>
@@ -2798,7 +3495,7 @@
         <w:pStyle w:val="TableCaption"/>
       </w:pPr>
       <w:r>
-        <w:t xml:space="preserve">Caractéristiques démographiques</w:t>
+        <w:t xml:space="preserve">Qualité de construction du logement</w:t>
       </w:r>
     </w:p>
     <w:tbl>
@@ -2806,7 +3503,7 @@
         <w:tblStyle w:val="Table"/>
         <w:tblW w:type="auto" w:w="0"/>
         <w:tblLook w:firstRow="1" w:lastRow="0" w:firstColumn="0" w:lastColumn="0" w:noHBand="0" w:noVBand="0" w:val="0020"/>
-        <w:tblCaption w:val="Caractéristiques démographiques"/>
+        <w:tblCaption w:val="Qualité de construction du logement"/>
       </w:tblPr>
       <w:tblGrid>
         <w:gridCol w:w="3960"/>
@@ -2833,100 +3530,651 @@
           <w:p>
             <w:pPr>
               <w:pStyle w:val="Compact"/>
-              <w:jc w:val="left"/>
-            </w:pPr>
-            <w:r>
-              <w:t xml:space="preserve">Valeur</w:t>
-            </w:r>
-          </w:p>
-        </w:tc>
-      </w:tr>
-      <w:tr>
-        <w:tc>
-          <w:tcPr/>
-          <w:p>
-            <w:pPr>
-              <w:pStyle w:val="Compact"/>
-              <w:jc w:val="left"/>
-            </w:pPr>
-            <w:r>
-              <w:t xml:space="preserve">Proportion de femmes</w:t>
-            </w:r>
-          </w:p>
-        </w:tc>
-        <w:tc>
-          <w:tcPr/>
-          <w:p>
-            <w:pPr>
-              <w:pStyle w:val="Compact"/>
-              <w:jc w:val="left"/>
-            </w:pPr>
-            <w:r>
-              <w:t xml:space="preserve">51.08%</w:t>
-            </w:r>
-          </w:p>
-        </w:tc>
-      </w:tr>
-      <w:tr>
-        <w:tc>
-          <w:tcPr/>
-          <w:p>
-            <w:pPr>
-              <w:pStyle w:val="Compact"/>
-              <w:jc w:val="left"/>
-            </w:pPr>
-            <w:r>
-              <w:t xml:space="preserve">Âge moyen des membres</w:t>
-            </w:r>
-          </w:p>
-        </w:tc>
-        <w:tc>
-          <w:tcPr/>
-          <w:p>
-            <w:pPr>
-              <w:pStyle w:val="Compact"/>
-              <w:jc w:val="left"/>
-            </w:pPr>
-            <w:r>
-              <w:t xml:space="preserve">23.06 ans</w:t>
-            </w:r>
-          </w:p>
-        </w:tc>
-      </w:tr>
-      <w:tr>
-        <w:tc>
-          <w:tcPr/>
-          <w:p>
-            <w:pPr>
-              <w:pStyle w:val="Compact"/>
-              <w:jc w:val="left"/>
-            </w:pPr>
-            <w:r>
-              <w:t xml:space="preserve">Proportion d’enfants (&lt; 5 ans)</w:t>
-            </w:r>
-          </w:p>
-        </w:tc>
-        <w:tc>
-          <w:tcPr/>
-          <w:p>
-            <w:pPr>
-              <w:pStyle w:val="Compact"/>
-              <w:jc w:val="left"/>
-            </w:pPr>
-            <w:r>
-              <w:t xml:space="preserve">11.27%</w:t>
+              <w:jc w:val="right"/>
+            </w:pPr>
+            <w:r>
+              <w:t xml:space="preserve">Proportion</w:t>
+            </w:r>
+          </w:p>
+        </w:tc>
+      </w:tr>
+      <w:tr>
+        <w:tc>
+          <w:tcPr/>
+          <w:p>
+            <w:pPr>
+              <w:pStyle w:val="Compact"/>
+              <w:jc w:val="left"/>
+            </w:pPr>
+            <w:r>
+              <w:t xml:space="preserve">Toit (matériaux améliorés) (%)</w:t>
+            </w:r>
+          </w:p>
+        </w:tc>
+        <w:tc>
+          <w:tcPr/>
+          <w:p>
+            <w:pPr>
+              <w:pStyle w:val="Compact"/>
+              <w:jc w:val="right"/>
+            </w:pPr>
+            <w:r>
+              <w:t xml:space="preserve">88.4</w:t>
+            </w:r>
+          </w:p>
+        </w:tc>
+      </w:tr>
+      <w:tr>
+        <w:tc>
+          <w:tcPr/>
+          <w:p>
+            <w:pPr>
+              <w:pStyle w:val="Compact"/>
+              <w:jc w:val="left"/>
+            </w:pPr>
+            <w:r>
+              <w:t xml:space="preserve">Murs (matériaux améliorés) (%)</w:t>
+            </w:r>
+          </w:p>
+        </w:tc>
+        <w:tc>
+          <w:tcPr/>
+          <w:p>
+            <w:pPr>
+              <w:pStyle w:val="Compact"/>
+              <w:jc w:val="right"/>
+            </w:pPr>
+            <w:r>
+              <w:t xml:space="preserve">71.1</w:t>
             </w:r>
           </w:p>
         </w:tc>
       </w:tr>
     </w:tbl>
-    <w:bookmarkStart w:id="38" w:name="répartition-par-âge-et-sexe"/>
+    <w:bookmarkEnd w:id="50"/>
+    <w:bookmarkStart w:id="51" w:name="emploi-et-occupation"/>
+    <w:p>
+      <w:pPr>
+        <w:pStyle w:val="Heading4"/>
+      </w:pPr>
+      <w:r>
+        <w:t xml:space="preserve">Emploi et Occupation</w:t>
+      </w:r>
+    </w:p>
+    <w:p>
+      <w:pPr>
+        <w:pStyle w:val="TableCaption"/>
+      </w:pPr>
+      <w:r>
+        <w:t xml:space="preserve">Répartition de la population par statut d’occupation</w:t>
+      </w:r>
+    </w:p>
+    <w:tbl>
+      <w:tblPr>
+        <w:tblStyle w:val="Table"/>
+        <w:tblW w:type="auto" w:w="0"/>
+        <w:tblLook w:firstRow="1" w:lastRow="0" w:firstColumn="0" w:lastColumn="0" w:noHBand="0" w:noVBand="0" w:val="0020"/>
+        <w:tblCaption w:val="Répartition de la population par statut d’occupation"/>
+      </w:tblPr>
+      <w:tblGrid>
+        <w:gridCol w:w="2640"/>
+        <w:gridCol w:w="2640"/>
+        <w:gridCol w:w="2640"/>
+      </w:tblGrid>
+      <w:tr>
+        <w:trPr>
+          <w:tblHeader w:val="on"/>
+        </w:trPr>
+        <w:tc>
+          <w:tcPr/>
+          <w:p>
+            <w:pPr>
+              <w:pStyle w:val="Compact"/>
+              <w:jc w:val="right"/>
+            </w:pPr>
+            <w:r>
+              <w:t xml:space="preserve">occupation</w:t>
+            </w:r>
+          </w:p>
+        </w:tc>
+        <w:tc>
+          <w:tcPr/>
+          <w:p>
+            <w:pPr>
+              <w:pStyle w:val="Compact"/>
+              <w:jc w:val="right"/>
+            </w:pPr>
+            <w:r>
+              <w:t xml:space="preserve">Effectif</w:t>
+            </w:r>
+          </w:p>
+        </w:tc>
+        <w:tc>
+          <w:tcPr/>
+          <w:p>
+            <w:pPr>
+              <w:pStyle w:val="Compact"/>
+              <w:jc w:val="right"/>
+            </w:pPr>
+            <w:r>
+              <w:t xml:space="preserve">Proportion</w:t>
+            </w:r>
+          </w:p>
+        </w:tc>
+      </w:tr>
+      <w:tr>
+        <w:tc>
+          <w:tcPr/>
+          <w:p>
+            <w:pPr>
+              <w:pStyle w:val="Compact"/>
+              <w:jc w:val="right"/>
+            </w:pPr>
+            <w:r>
+              <w:t xml:space="preserve">0</w:t>
+            </w:r>
+          </w:p>
+        </w:tc>
+        <w:tc>
+          <w:tcPr/>
+          <w:p>
+            <w:pPr>
+              <w:pStyle w:val="Compact"/>
+              <w:jc w:val="right"/>
+            </w:pPr>
+            <w:r>
+              <w:t xml:space="preserve">7683</w:t>
+            </w:r>
+          </w:p>
+        </w:tc>
+        <w:tc>
+          <w:tcPr/>
+          <w:p>
+            <w:pPr>
+              <w:pStyle w:val="Compact"/>
+              <w:jc w:val="right"/>
+            </w:pPr>
+            <w:r>
+              <w:t xml:space="preserve">60.2</w:t>
+            </w:r>
+          </w:p>
+        </w:tc>
+      </w:tr>
+      <w:tr>
+        <w:tc>
+          <w:tcPr/>
+          <w:p>
+            <w:pPr>
+              <w:pStyle w:val="Compact"/>
+              <w:jc w:val="right"/>
+            </w:pPr>
+            <w:r>
+              <w:t xml:space="preserve">1</w:t>
+            </w:r>
+          </w:p>
+        </w:tc>
+        <w:tc>
+          <w:tcPr/>
+          <w:p>
+            <w:pPr>
+              <w:pStyle w:val="Compact"/>
+              <w:jc w:val="right"/>
+            </w:pPr>
+            <w:r>
+              <w:t xml:space="preserve">92</w:t>
+            </w:r>
+          </w:p>
+        </w:tc>
+        <w:tc>
+          <w:tcPr/>
+          <w:p>
+            <w:pPr>
+              <w:pStyle w:val="Compact"/>
+              <w:jc w:val="right"/>
+            </w:pPr>
+            <w:r>
+              <w:t xml:space="preserve">0.7</w:t>
+            </w:r>
+          </w:p>
+        </w:tc>
+      </w:tr>
+      <w:tr>
+        <w:tc>
+          <w:tcPr/>
+          <w:p>
+            <w:pPr>
+              <w:pStyle w:val="Compact"/>
+              <w:jc w:val="right"/>
+            </w:pPr>
+            <w:r>
+              <w:t xml:space="preserve">2</w:t>
+            </w:r>
+          </w:p>
+        </w:tc>
+        <w:tc>
+          <w:tcPr/>
+          <w:p>
+            <w:pPr>
+              <w:pStyle w:val="Compact"/>
+              <w:jc w:val="right"/>
+            </w:pPr>
+            <w:r>
+              <w:t xml:space="preserve">9</w:t>
+            </w:r>
+          </w:p>
+        </w:tc>
+        <w:tc>
+          <w:tcPr/>
+          <w:p>
+            <w:pPr>
+              <w:pStyle w:val="Compact"/>
+              <w:jc w:val="right"/>
+            </w:pPr>
+            <w:r>
+              <w:t xml:space="preserve">0.1</w:t>
+            </w:r>
+          </w:p>
+        </w:tc>
+      </w:tr>
+      <w:tr>
+        <w:tc>
+          <w:tcPr/>
+          <w:p>
+            <w:pPr>
+              <w:pStyle w:val="Compact"/>
+              <w:jc w:val="right"/>
+            </w:pPr>
+            <w:r>
+              <w:t xml:space="preserve">3</w:t>
+            </w:r>
+          </w:p>
+        </w:tc>
+        <w:tc>
+          <w:tcPr/>
+          <w:p>
+            <w:pPr>
+              <w:pStyle w:val="Compact"/>
+              <w:jc w:val="right"/>
+            </w:pPr>
+            <w:r>
+              <w:t xml:space="preserve">54</w:t>
+            </w:r>
+          </w:p>
+        </w:tc>
+        <w:tc>
+          <w:tcPr/>
+          <w:p>
+            <w:pPr>
+              <w:pStyle w:val="Compact"/>
+              <w:jc w:val="right"/>
+            </w:pPr>
+            <w:r>
+              <w:t xml:space="preserve">0.4</w:t>
+            </w:r>
+          </w:p>
+        </w:tc>
+      </w:tr>
+      <w:tr>
+        <w:tc>
+          <w:tcPr/>
+          <w:p>
+            <w:pPr>
+              <w:pStyle w:val="Compact"/>
+              <w:jc w:val="right"/>
+            </w:pPr>
+            <w:r>
+              <w:t xml:space="preserve">4</w:t>
+            </w:r>
+          </w:p>
+        </w:tc>
+        <w:tc>
+          <w:tcPr/>
+          <w:p>
+            <w:pPr>
+              <w:pStyle w:val="Compact"/>
+              <w:jc w:val="right"/>
+            </w:pPr>
+            <w:r>
+              <w:t xml:space="preserve">125</w:t>
+            </w:r>
+          </w:p>
+        </w:tc>
+        <w:tc>
+          <w:tcPr/>
+          <w:p>
+            <w:pPr>
+              <w:pStyle w:val="Compact"/>
+              <w:jc w:val="right"/>
+            </w:pPr>
+            <w:r>
+              <w:t xml:space="preserve">1.0</w:t>
+            </w:r>
+          </w:p>
+        </w:tc>
+      </w:tr>
+      <w:tr>
+        <w:tc>
+          <w:tcPr/>
+          <w:p>
+            <w:pPr>
+              <w:pStyle w:val="Compact"/>
+              <w:jc w:val="right"/>
+            </w:pPr>
+            <w:r>
+              <w:t xml:space="preserve">5</w:t>
+            </w:r>
+          </w:p>
+        </w:tc>
+        <w:tc>
+          <w:tcPr/>
+          <w:p>
+            <w:pPr>
+              <w:pStyle w:val="Compact"/>
+              <w:jc w:val="right"/>
+            </w:pPr>
+            <w:r>
+              <w:t xml:space="preserve">99</w:t>
+            </w:r>
+          </w:p>
+        </w:tc>
+        <w:tc>
+          <w:tcPr/>
+          <w:p>
+            <w:pPr>
+              <w:pStyle w:val="Compact"/>
+              <w:jc w:val="right"/>
+            </w:pPr>
+            <w:r>
+              <w:t xml:space="preserve">0.8</w:t>
+            </w:r>
+          </w:p>
+        </w:tc>
+      </w:tr>
+      <w:tr>
+        <w:tc>
+          <w:tcPr/>
+          <w:p>
+            <w:pPr>
+              <w:pStyle w:val="Compact"/>
+              <w:jc w:val="right"/>
+            </w:pPr>
+            <w:r>
+              <w:t xml:space="preserve">6</w:t>
+            </w:r>
+          </w:p>
+        </w:tc>
+        <w:tc>
+          <w:tcPr/>
+          <w:p>
+            <w:pPr>
+              <w:pStyle w:val="Compact"/>
+              <w:jc w:val="right"/>
+            </w:pPr>
+            <w:r>
+              <w:t xml:space="preserve">147</w:t>
+            </w:r>
+          </w:p>
+        </w:tc>
+        <w:tc>
+          <w:tcPr/>
+          <w:p>
+            <w:pPr>
+              <w:pStyle w:val="Compact"/>
+              <w:jc w:val="right"/>
+            </w:pPr>
+            <w:r>
+              <w:t xml:space="preserve">1.2</w:t>
+            </w:r>
+          </w:p>
+        </w:tc>
+      </w:tr>
+      <w:tr>
+        <w:tc>
+          <w:tcPr/>
+          <w:p>
+            <w:pPr>
+              <w:pStyle w:val="Compact"/>
+              <w:jc w:val="right"/>
+            </w:pPr>
+            <w:r>
+              <w:t xml:space="preserve">7</w:t>
+            </w:r>
+          </w:p>
+        </w:tc>
+        <w:tc>
+          <w:tcPr/>
+          <w:p>
+            <w:pPr>
+              <w:pStyle w:val="Compact"/>
+              <w:jc w:val="right"/>
+            </w:pPr>
+            <w:r>
+              <w:t xml:space="preserve">33</w:t>
+            </w:r>
+          </w:p>
+        </w:tc>
+        <w:tc>
+          <w:tcPr/>
+          <w:p>
+            <w:pPr>
+              <w:pStyle w:val="Compact"/>
+              <w:jc w:val="right"/>
+            </w:pPr>
+            <w:r>
+              <w:t xml:space="preserve">0.3</w:t>
+            </w:r>
+          </w:p>
+        </w:tc>
+      </w:tr>
+      <w:tr>
+        <w:tc>
+          <w:tcPr/>
+          <w:p>
+            <w:pPr>
+              <w:pStyle w:val="Compact"/>
+              <w:jc w:val="right"/>
+            </w:pPr>
+            <w:r>
+              <w:t xml:space="preserve">8</w:t>
+            </w:r>
+          </w:p>
+        </w:tc>
+        <w:tc>
+          <w:tcPr/>
+          <w:p>
+            <w:pPr>
+              <w:pStyle w:val="Compact"/>
+              <w:jc w:val="right"/>
+            </w:pPr>
+            <w:r>
+              <w:t xml:space="preserve">2083</w:t>
+            </w:r>
+          </w:p>
+        </w:tc>
+        <w:tc>
+          <w:tcPr/>
+          <w:p>
+            <w:pPr>
+              <w:pStyle w:val="Compact"/>
+              <w:jc w:val="right"/>
+            </w:pPr>
+            <w:r>
+              <w:t xml:space="preserve">16.3</w:t>
+            </w:r>
+          </w:p>
+        </w:tc>
+      </w:tr>
+      <w:tr>
+        <w:tc>
+          <w:tcPr/>
+          <w:p>
+            <w:pPr>
+              <w:pStyle w:val="Compact"/>
+              <w:jc w:val="right"/>
+            </w:pPr>
+            <w:r>
+              <w:t xml:space="preserve">9</w:t>
+            </w:r>
+          </w:p>
+        </w:tc>
+        <w:tc>
+          <w:tcPr/>
+          <w:p>
+            <w:pPr>
+              <w:pStyle w:val="Compact"/>
+              <w:jc w:val="right"/>
+            </w:pPr>
+            <w:r>
+              <w:t xml:space="preserve">468</w:t>
+            </w:r>
+          </w:p>
+        </w:tc>
+        <w:tc>
+          <w:tcPr/>
+          <w:p>
+            <w:pPr>
+              <w:pStyle w:val="Compact"/>
+              <w:jc w:val="right"/>
+            </w:pPr>
+            <w:r>
+              <w:t xml:space="preserve">3.7</w:t>
+            </w:r>
+          </w:p>
+        </w:tc>
+      </w:tr>
+      <w:tr>
+        <w:tc>
+          <w:tcPr/>
+          <w:p>
+            <w:pPr>
+              <w:pStyle w:val="Compact"/>
+              <w:jc w:val="right"/>
+            </w:pPr>
+            <w:r>
+              <w:t xml:space="preserve">10</w:t>
+            </w:r>
+          </w:p>
+        </w:tc>
+        <w:tc>
+          <w:tcPr/>
+          <w:p>
+            <w:pPr>
+              <w:pStyle w:val="Compact"/>
+              <w:jc w:val="right"/>
+            </w:pPr>
+            <w:r>
+              <w:t xml:space="preserve">1361</w:t>
+            </w:r>
+          </w:p>
+        </w:tc>
+        <w:tc>
+          <w:tcPr/>
+          <w:p>
+            <w:pPr>
+              <w:pStyle w:val="Compact"/>
+              <w:jc w:val="right"/>
+            </w:pPr>
+            <w:r>
+              <w:t xml:space="preserve">10.7</w:t>
+            </w:r>
+          </w:p>
+        </w:tc>
+      </w:tr>
+      <w:tr>
+        <w:tc>
+          <w:tcPr/>
+          <w:p>
+            <w:pPr>
+              <w:pStyle w:val="Compact"/>
+              <w:jc w:val="right"/>
+            </w:pPr>
+            <w:r>
+              <w:t xml:space="preserve">11</w:t>
+            </w:r>
+          </w:p>
+        </w:tc>
+        <w:tc>
+          <w:tcPr/>
+          <w:p>
+            <w:pPr>
+              <w:pStyle w:val="Compact"/>
+              <w:jc w:val="right"/>
+            </w:pPr>
+            <w:r>
+              <w:t xml:space="preserve">105</w:t>
+            </w:r>
+          </w:p>
+        </w:tc>
+        <w:tc>
+          <w:tcPr/>
+          <w:p>
+            <w:pPr>
+              <w:pStyle w:val="Compact"/>
+              <w:jc w:val="right"/>
+            </w:pPr>
+            <w:r>
+              <w:t xml:space="preserve">0.8</w:t>
+            </w:r>
+          </w:p>
+        </w:tc>
+      </w:tr>
+      <w:tr>
+        <w:tc>
+          <w:tcPr/>
+          <w:p>
+            <w:pPr>
+              <w:pStyle w:val="Compact"/>
+              <w:jc w:val="right"/>
+            </w:pPr>
+            <w:r>
+              <w:t xml:space="preserve">12</w:t>
+            </w:r>
+          </w:p>
+        </w:tc>
+        <w:tc>
+          <w:tcPr/>
+          <w:p>
+            <w:pPr>
+              <w:pStyle w:val="Compact"/>
+              <w:jc w:val="right"/>
+            </w:pPr>
+            <w:r>
+              <w:t xml:space="preserve">500</w:t>
+            </w:r>
+          </w:p>
+        </w:tc>
+        <w:tc>
+          <w:tcPr/>
+          <w:p>
+            <w:pPr>
+              <w:pStyle w:val="Compact"/>
+              <w:jc w:val="right"/>
+            </w:pPr>
+            <w:r>
+              <w:t xml:space="preserve">3.9</w:t>
+            </w:r>
+          </w:p>
+        </w:tc>
+      </w:tr>
+    </w:tbl>
+    <w:bookmarkEnd w:id="51"/>
+    <w:bookmarkEnd w:id="52"/>
+    <w:bookmarkStart w:id="57" w:name="actifs-possédés-et-sources-de-revenus"/>
     <w:p>
       <w:pPr>
         <w:pStyle w:val="Heading3"/>
       </w:pPr>
       <w:r>
-        <w:t xml:space="preserve">Répartition par âge et sexe</w:t>
+        <w:t xml:space="preserve">Actifs possédés et Sources de Revenus</w:t>
+      </w:r>
+    </w:p>
+    <w:bookmarkStart w:id="56" w:name="possession-des-actifs-détail"/>
+    <w:p>
+      <w:pPr>
+        <w:pStyle w:val="Heading4"/>
+      </w:pPr>
+      <w:r>
+        <w:t xml:space="preserve">Possession des actifs (Détail)</w:t>
       </w:r>
     </w:p>
     <w:p>
@@ -2938,18 +4186,18 @@
           <wp:inline>
             <wp:extent cx="5334000" cy="3333750"/>
             <wp:effectExtent b="0" l="0" r="0" t="0"/>
-            <wp:docPr descr="" title="" id="36" name="Picture"/>
+            <wp:docPr descr="" title="" id="54" name="Picture"/>
             <a:graphic>
               <a:graphicData uri="http://schemas.openxmlformats.org/drawingml/2006/picture">
                 <pic:pic>
                   <pic:nvPicPr>
-                    <pic:cNvPr descr="C:\Users\USER\Documents\ENSAE\ISE3\traitements des données statistiques\Projet_Traitement_Analyse\PUDC_Pipeline\data\output\QAQC_Report_files/2732537bfac8891fae7d090d3ab0ae4fa4b1bff6.png" id="37" name="Picture"/>
+                    <pic:cNvPr descr="C:\Users\USER\Documents\ENSAE\ISE3\traitements des données statistiques\Projet_Traitement_Analyse\PUDC_Pipeline\data\output\QAQC_Report_files/f630c3a29016fc16491729b458e0dcdbd3e563d6.png" id="55" name="Picture"/>
                     <pic:cNvPicPr>
                       <a:picLocks noChangeArrowheads="1" noChangeAspect="1"/>
                     </pic:cNvPicPr>
                   </pic:nvPicPr>
                   <pic:blipFill>
-                    <a:blip r:embed="rId35"/>
+                    <a:blip r:embed="rId53"/>
                     <a:stretch>
                       <a:fillRect/>
                     </a:stretch>
@@ -2976,24 +4224,15 @@
         </w:drawing>
       </w:r>
     </w:p>
-    <w:bookmarkEnd w:id="38"/>
-    <w:bookmarkEnd w:id="39"/>
-    <w:bookmarkStart w:id="78" w:name="Xf061c28e976c1f344959c670032bcc83fdbc8eb"/>
-    <w:p>
-      <w:pPr>
-        <w:pStyle w:val="Heading2"/>
-      </w:pPr>
-      <w:r>
-        <w:t xml:space="preserve">4. Caractéristiques du Logement et Accès aux Services</w:t>
-      </w:r>
-    </w:p>
-    <w:bookmarkStart w:id="47" w:name="accès-à-leau-potable-standard-jmp"/>
+    <w:bookmarkEnd w:id="56"/>
+    <w:bookmarkEnd w:id="57"/>
+    <w:bookmarkStart w:id="65" w:name="Xcdd1a43f1baf159117e1f730194057bacaed1fd"/>
     <w:p>
       <w:pPr>
         <w:pStyle w:val="Heading3"/>
       </w:pPr>
       <w:r>
-        <w:t xml:space="preserve">Accès à l’Eau Potable (Standard JMP)</w:t>
+        <w:t xml:space="preserve">Index de Richesse (Analyse en Composantes Principales - ACP)</w:t>
       </w:r>
     </w:p>
     <w:p>
@@ -3001,9 +4240,240 @@
         <w:pStyle w:val="FirstParagraph"/>
       </w:pPr>
       <w:r>
-        <w:t xml:space="preserve">L’accès à une source d’eau potable améliorée a été recalculé conformément aux standards JMP de l’OMS/UNICEF.</w:t>
-      </w:r>
-    </w:p>
+        <w:t xml:space="preserve">L’indice de richesse a été construit en utilisant une ACP sur la base de la possession de plusieurs actifs.</w:t>
+      </w:r>
+    </w:p>
+    <w:p>
+      <w:pPr>
+        <w:pStyle w:val="TableCaption"/>
+      </w:pPr>
+      <w:r>
+        <w:t xml:space="preserve">Indicateurs de richesse et conditions de logement</w:t>
+      </w:r>
+    </w:p>
+    <w:tbl>
+      <w:tblPr>
+        <w:tblStyle w:val="Table"/>
+        <w:tblW w:type="auto" w:w="0"/>
+        <w:tblLook w:firstRow="1" w:lastRow="0" w:firstColumn="0" w:lastColumn="0" w:noHBand="0" w:noVBand="0" w:val="0020"/>
+        <w:tblCaption w:val="Indicateurs de richesse et conditions de logement"/>
+      </w:tblPr>
+      <w:tblGrid>
+        <w:gridCol w:w="3960"/>
+        <w:gridCol w:w="3960"/>
+      </w:tblGrid>
+      <w:tr>
+        <w:trPr>
+          <w:tblHeader w:val="on"/>
+        </w:trPr>
+        <w:tc>
+          <w:tcPr/>
+          <w:p>
+            <w:pPr>
+              <w:pStyle w:val="Compact"/>
+              <w:jc w:val="left"/>
+            </w:pPr>
+            <w:r>
+              <w:t xml:space="preserve">Indicateur</w:t>
+            </w:r>
+          </w:p>
+        </w:tc>
+        <w:tc>
+          <w:tcPr/>
+          <w:p>
+            <w:pPr>
+              <w:pStyle w:val="Compact"/>
+              <w:jc w:val="left"/>
+            </w:pPr>
+            <w:r>
+              <w:t xml:space="preserve">Valeur</w:t>
+            </w:r>
+          </w:p>
+        </w:tc>
+      </w:tr>
+      <w:tr>
+        <w:tc>
+          <w:tcPr/>
+          <w:p>
+            <w:pPr>
+              <w:pStyle w:val="Compact"/>
+              <w:jc w:val="left"/>
+            </w:pPr>
+            <w:r>
+              <w:t xml:space="preserve">Score moyen d’actifs (non pondéré)</w:t>
+            </w:r>
+          </w:p>
+        </w:tc>
+        <w:tc>
+          <w:tcPr/>
+          <w:p>
+            <w:pPr>
+              <w:pStyle w:val="Compact"/>
+              <w:jc w:val="left"/>
+            </w:pPr>
+            <w:r>
+              <w:t xml:space="preserve">2.37</w:t>
+            </w:r>
+          </w:p>
+        </w:tc>
+      </w:tr>
+      <w:tr>
+        <w:tc>
+          <w:tcPr/>
+          <w:p>
+            <w:pPr>
+              <w:pStyle w:val="Compact"/>
+              <w:jc w:val="left"/>
+            </w:pPr>
+            <w:r>
+              <w:t xml:space="preserve">Index Richesse ACP (Moyenne)</w:t>
+            </w:r>
+          </w:p>
+        </w:tc>
+        <w:tc>
+          <w:tcPr/>
+          <w:p>
+            <w:pPr>
+              <w:pStyle w:val="Compact"/>
+              <w:jc w:val="left"/>
+            </w:pPr>
+            <w:r>
+              <w:t xml:space="preserve">0</w:t>
+            </w:r>
+          </w:p>
+        </w:tc>
+      </w:tr>
+      <w:tr>
+        <w:tc>
+          <w:tcPr/>
+          <w:p>
+            <w:pPr>
+              <w:pStyle w:val="Compact"/>
+              <w:jc w:val="left"/>
+            </w:pPr>
+            <w:r>
+              <w:t xml:space="preserve">Index Richesse ACP (Min)</w:t>
+            </w:r>
+          </w:p>
+        </w:tc>
+        <w:tc>
+          <w:tcPr/>
+          <w:p>
+            <w:pPr>
+              <w:pStyle w:val="Compact"/>
+              <w:jc w:val="left"/>
+            </w:pPr>
+            <w:r>
+              <w:t xml:space="preserve">-0.99</w:t>
+            </w:r>
+          </w:p>
+        </w:tc>
+      </w:tr>
+      <w:tr>
+        <w:tc>
+          <w:tcPr/>
+          <w:p>
+            <w:pPr>
+              <w:pStyle w:val="Compact"/>
+              <w:jc w:val="left"/>
+            </w:pPr>
+            <w:r>
+              <w:t xml:space="preserve">Index Richesse ACP (Max)</w:t>
+            </w:r>
+          </w:p>
+        </w:tc>
+        <w:tc>
+          <w:tcPr/>
+          <w:p>
+            <w:pPr>
+              <w:pStyle w:val="Compact"/>
+              <w:jc w:val="left"/>
+            </w:pPr>
+            <w:r>
+              <w:t xml:space="preserve">10.75</w:t>
+            </w:r>
+          </w:p>
+        </w:tc>
+      </w:tr>
+      <w:tr>
+        <w:tc>
+          <w:tcPr/>
+          <w:p>
+            <w:pPr>
+              <w:pStyle w:val="Compact"/>
+              <w:jc w:val="left"/>
+            </w:pPr>
+            <w:r>
+              <w:t xml:space="preserve">Index Richesse ACP (Écart-Type)</w:t>
+            </w:r>
+          </w:p>
+        </w:tc>
+        <w:tc>
+          <w:tcPr/>
+          <w:p>
+            <w:pPr>
+              <w:pStyle w:val="Compact"/>
+              <w:jc w:val="left"/>
+            </w:pPr>
+            <w:r>
+              <w:t xml:space="preserve">1.45</w:t>
+            </w:r>
+          </w:p>
+        </w:tc>
+      </w:tr>
+      <w:tr>
+        <w:tc>
+          <w:tcPr/>
+          <w:p>
+            <w:pPr>
+              <w:pStyle w:val="Compact"/>
+              <w:jc w:val="left"/>
+            </w:pPr>
+            <w:r>
+              <w:t xml:space="preserve">Nombre moyen de pièces</w:t>
+            </w:r>
+          </w:p>
+        </w:tc>
+        <w:tc>
+          <w:tcPr/>
+          <w:p>
+            <w:pPr>
+              <w:pStyle w:val="Compact"/>
+              <w:jc w:val="left"/>
+            </w:pPr>
+            <w:r>
+              <w:t xml:space="preserve">4.78</w:t>
+            </w:r>
+          </w:p>
+        </w:tc>
+      </w:tr>
+      <w:tr>
+        <w:tc>
+          <w:tcPr/>
+          <w:p>
+            <w:pPr>
+              <w:pStyle w:val="Compact"/>
+              <w:jc w:val="left"/>
+            </w:pPr>
+            <w:r>
+              <w:t xml:space="preserve">Valeurs aberrantes détectées (Nb pièces)</w:t>
+            </w:r>
+          </w:p>
+        </w:tc>
+        <w:tc>
+          <w:tcPr/>
+          <w:p>
+            <w:pPr>
+              <w:pStyle w:val="Compact"/>
+              <w:jc w:val="left"/>
+            </w:pPr>
+            <w:r>
+              <w:t xml:space="preserve">61</w:t>
+            </w:r>
+          </w:p>
+        </w:tc>
+      </w:tr>
+    </w:tbl>
     <w:p>
       <w:pPr>
         <w:pStyle w:val="BodyText"/>
@@ -3011,20 +4481,76 @@
       <w:r>
         <w:drawing>
           <wp:inline>
-            <wp:extent cx="5334000" cy="3556000"/>
+            <wp:extent cx="5334000" cy="3333750"/>
             <wp:effectExtent b="0" l="0" r="0" t="0"/>
-            <wp:docPr descr="" title="" id="41" name="Picture"/>
+            <wp:docPr descr="" title="" id="59" name="Picture"/>
             <a:graphic>
               <a:graphicData uri="http://schemas.openxmlformats.org/drawingml/2006/picture">
                 <pic:pic>
                   <pic:nvPicPr>
-                    <pic:cNvPr descr="C:\Users\USER\Documents\ENSAE\ISE3\traitements des données statistiques\Projet_Traitement_Analyse\PUDC_Pipeline\data\output\QAQC_Report_files/a36151f17493d756981aa3324eb5f5dc3e09dd51.png" id="42" name="Picture"/>
+                    <pic:cNvPr descr="C:\Users\USER\Documents\ENSAE\ISE3\traitements des données statistiques\Projet_Traitement_Analyse\PUDC_Pipeline\data\output\QAQC_Report_files/46468853406931ce8d17d973ac6e38ed0acc9cf8.png" id="60" name="Picture"/>
                     <pic:cNvPicPr>
                       <a:picLocks noChangeArrowheads="1" noChangeAspect="1"/>
                     </pic:cNvPicPr>
                   </pic:nvPicPr>
                   <pic:blipFill>
-                    <a:blip r:embed="rId40"/>
+                    <a:blip r:embed="rId58"/>
+                    <a:stretch>
+                      <a:fillRect/>
+                    </a:stretch>
+                  </pic:blipFill>
+                  <pic:spPr bwMode="auto">
+                    <a:xfrm>
+                      <a:off x="0" y="0"/>
+                      <a:ext cx="5334000" cy="3333750"/>
+                    </a:xfrm>
+                    <a:prstGeom prst="rect">
+                      <a:avLst/>
+                    </a:prstGeom>
+                    <a:noFill/>
+                    <a:ln w="9525">
+                      <a:noFill/>
+                      <a:headEnd/>
+                      <a:tailEnd/>
+                    </a:ln>
+                  </pic:spPr>
+                </pic:pic>
+              </a:graphicData>
+            </a:graphic>
+          </wp:inline>
+        </w:drawing>
+      </w:r>
+    </w:p>
+    <w:bookmarkStart w:id="64" w:name="X6753b94b28982f8df2331fa4038dc6243812065"/>
+    <w:p>
+      <w:pPr>
+        <w:pStyle w:val="Heading4"/>
+      </w:pPr>
+      <w:r>
+        <w:t xml:space="preserve">Relation bivariée : Taille du ménage vs Score ACP</w:t>
+      </w:r>
+    </w:p>
+    <w:p>
+      <w:pPr>
+        <w:pStyle w:val="FirstParagraph"/>
+      </w:pPr>
+      <w:r>
+        <w:drawing>
+          <wp:inline>
+            <wp:extent cx="5334000" cy="3556000"/>
+            <wp:effectExtent b="0" l="0" r="0" t="0"/>
+            <wp:docPr descr="" title="" id="62" name="Picture"/>
+            <a:graphic>
+              <a:graphicData uri="http://schemas.openxmlformats.org/drawingml/2006/picture">
+                <pic:pic>
+                  <pic:nvPicPr>
+                    <pic:cNvPr descr="C:\Users\USER\Documents\ENSAE\ISE3\traitements des données statistiques\Projet_Traitement_Analyse\PUDC_Pipeline\data\output\QAQC_Report_files/1c2a7e41fe6f7e735bfbc66bb4712ebb8d496dba.png" id="63" name="Picture"/>
+                    <pic:cNvPicPr>
+                      <a:picLocks noChangeArrowheads="1" noChangeAspect="1"/>
+                    </pic:cNvPicPr>
+                  </pic:nvPicPr>
+                  <pic:blipFill>
+                    <a:blip r:embed="rId61"/>
                     <a:stretch>
                       <a:fillRect/>
                     </a:stretch>
@@ -3051,13 +4577,15 @@
         </w:drawing>
       </w:r>
     </w:p>
-    <w:bookmarkStart w:id="46" w:name="accès-à-lassainissement-amélioré"/>
-    <w:p>
-      <w:pPr>
-        <w:pStyle w:val="Heading4"/>
-      </w:pPr>
-      <w:r>
-        <w:t xml:space="preserve">Accès à l’Assainissement Amélioré</w:t>
+    <w:bookmarkEnd w:id="64"/>
+    <w:bookmarkEnd w:id="65"/>
+    <w:bookmarkStart w:id="69" w:name="quintiles-de-richesse-méthode-dhs"/>
+    <w:p>
+      <w:pPr>
+        <w:pStyle w:val="Heading3"/>
+      </w:pPr>
+      <w:r>
+        <w:t xml:space="preserve">Quintiles de richesse (méthode DHS)</w:t>
       </w:r>
     </w:p>
     <w:p>
@@ -3065,147 +4593,9 @@
         <w:pStyle w:val="FirstParagraph"/>
       </w:pPr>
       <w:r>
-        <w:t xml:space="preserve">L’assainissement est mesuré par le type de toilettes utilisées par le ménage.</w:t>
-      </w:r>
-    </w:p>
-    <w:p>
-      <w:pPr>
-        <w:pStyle w:val="TableCaption"/>
-      </w:pPr>
-      <w:r>
-        <w:t xml:space="preserve">Distribution de l’accès à l’assainissement</w:t>
-      </w:r>
-    </w:p>
-    <w:tbl>
-      <w:tblPr>
-        <w:tblStyle w:val="Table"/>
-        <w:tblW w:type="auto" w:w="0"/>
-        <w:tblLook w:firstRow="1" w:lastRow="0" w:firstColumn="0" w:lastColumn="0" w:noHBand="0" w:noVBand="0" w:val="0020"/>
-        <w:tblCaption w:val="Distribution de l’accès à l’assainissement"/>
-      </w:tblPr>
-      <w:tblGrid>
-        <w:gridCol w:w="2640"/>
-        <w:gridCol w:w="2640"/>
-        <w:gridCol w:w="2640"/>
-      </w:tblGrid>
-      <w:tr>
-        <w:trPr>
-          <w:tblHeader w:val="on"/>
-        </w:trPr>
-        <w:tc>
-          <w:tcPr/>
-          <w:p>
-            <w:pPr>
-              <w:pStyle w:val="Compact"/>
-              <w:jc w:val="left"/>
-            </w:pPr>
-            <w:r>
-              <w:t xml:space="preserve">assainissement_ameliore</w:t>
-            </w:r>
-          </w:p>
-        </w:tc>
-        <w:tc>
-          <w:tcPr/>
-          <w:p>
-            <w:pPr>
-              <w:pStyle w:val="Compact"/>
-              <w:jc w:val="right"/>
-            </w:pPr>
-            <w:r>
-              <w:t xml:space="preserve">Effectif</w:t>
-            </w:r>
-          </w:p>
-        </w:tc>
-        <w:tc>
-          <w:tcPr/>
-          <w:p>
-            <w:pPr>
-              <w:pStyle w:val="Compact"/>
-              <w:jc w:val="right"/>
-            </w:pPr>
-            <w:r>
-              <w:t xml:space="preserve">Proportion</w:t>
-            </w:r>
-          </w:p>
-        </w:tc>
-      </w:tr>
-      <w:tr>
-        <w:tc>
-          <w:tcPr/>
-          <w:p>
-            <w:pPr>
-              <w:pStyle w:val="Compact"/>
-              <w:jc w:val="left"/>
-            </w:pPr>
-            <w:r>
-              <w:t xml:space="preserve">Amélioré</w:t>
-            </w:r>
-          </w:p>
-        </w:tc>
-        <w:tc>
-          <w:tcPr/>
-          <w:p>
-            <w:pPr>
-              <w:pStyle w:val="Compact"/>
-              <w:jc w:val="right"/>
-            </w:pPr>
-            <w:r>
-              <w:t xml:space="preserve">999</w:t>
-            </w:r>
-          </w:p>
-        </w:tc>
-        <w:tc>
-          <w:tcPr/>
-          <w:p>
-            <w:pPr>
-              <w:pStyle w:val="Compact"/>
-              <w:jc w:val="right"/>
-            </w:pPr>
-            <w:r>
-              <w:t xml:space="preserve">59.3</w:t>
-            </w:r>
-          </w:p>
-        </w:tc>
-      </w:tr>
-      <w:tr>
-        <w:tc>
-          <w:tcPr/>
-          <w:p>
-            <w:pPr>
-              <w:pStyle w:val="Compact"/>
-              <w:jc w:val="left"/>
-            </w:pPr>
-            <w:r>
-              <w:t xml:space="preserve">Non Amélioré</w:t>
-            </w:r>
-          </w:p>
-        </w:tc>
-        <w:tc>
-          <w:tcPr/>
-          <w:p>
-            <w:pPr>
-              <w:pStyle w:val="Compact"/>
-              <w:jc w:val="right"/>
-            </w:pPr>
-            <w:r>
-              <w:t xml:space="preserve">687</w:t>
-            </w:r>
-          </w:p>
-        </w:tc>
-        <w:tc>
-          <w:tcPr/>
-          <w:p>
-            <w:pPr>
-              <w:pStyle w:val="Compact"/>
-              <w:jc w:val="right"/>
-            </w:pPr>
-            <w:r>
-              <w:t xml:space="preserve">40.7</w:t>
-            </w:r>
-          </w:p>
-        </w:tc>
-      </w:tr>
-    </w:tbl>
+        <w:t xml:space="preserve">Les quintiles sont calculés à l’intérieur de chaque milieu (Rural/Urbain) afin de ne pas confondre richesse et milieu.</w:t>
+      </w:r>
+    </w:p>
     <w:p>
       <w:pPr>
         <w:pStyle w:val="BodyText"/>
@@ -3213,1116 +4603,20 @@
       <w:r>
         <w:drawing>
           <wp:inline>
-            <wp:extent cx="5334000" cy="3556000"/>
+            <wp:extent cx="5334000" cy="3333750"/>
             <wp:effectExtent b="0" l="0" r="0" t="0"/>
-            <wp:docPr descr="" title="" id="44" name="Picture"/>
+            <wp:docPr descr="" title="" id="67" name="Picture"/>
             <a:graphic>
               <a:graphicData uri="http://schemas.openxmlformats.org/drawingml/2006/picture">
                 <pic:pic>
                   <pic:nvPicPr>
-                    <pic:cNvPr descr="C:\Users\USER\Documents\ENSAE\ISE3\traitements des données statistiques\Projet_Traitement_Analyse\PUDC_Pipeline\data\output\QAQC_Report_files/a181379f9192ad5e1b0791eea8abb1eefa8411af.png" id="45" name="Picture"/>
+                    <pic:cNvPr descr="C:\Users\USER\Documents\ENSAE\ISE3\traitements des données statistiques\Projet_Traitement_Analyse\PUDC_Pipeline\data\output\QAQC_Report_files/f202614af1728cba9a864f27f7f91cdba096cf76.png" id="68" name="Picture"/>
                     <pic:cNvPicPr>
                       <a:picLocks noChangeArrowheads="1" noChangeAspect="1"/>
                     </pic:cNvPicPr>
                   </pic:nvPicPr>
                   <pic:blipFill>
-                    <a:blip r:embed="rId43"/>
-                    <a:stretch>
-                      <a:fillRect/>
-                    </a:stretch>
-                  </pic:blipFill>
-                  <pic:spPr bwMode="auto">
-                    <a:xfrm>
-                      <a:off x="0" y="0"/>
-                      <a:ext cx="5334000" cy="3556000"/>
-                    </a:xfrm>
-                    <a:prstGeom prst="rect">
-                      <a:avLst/>
-                    </a:prstGeom>
-                    <a:noFill/>
-                    <a:ln w="9525">
-                      <a:noFill/>
-                      <a:headEnd/>
-                      <a:tailEnd/>
-                    </a:ln>
-                  </pic:spPr>
-                </pic:pic>
-              </a:graphicData>
-            </a:graphic>
-          </wp:inline>
-        </w:drawing>
-      </w:r>
-    </w:p>
-    <w:bookmarkEnd w:id="46"/>
-    <w:bookmarkEnd w:id="47"/>
-    <w:bookmarkStart w:id="53" w:name="Xd6c59849d06dfb12dc45ff22cb76ce52d4ccd89"/>
-    <w:p>
-      <w:pPr>
-        <w:pStyle w:val="Heading3"/>
-      </w:pPr>
-      <w:r>
-        <w:t xml:space="preserve">Éducation et Caractéristiques du Chef de Ménage</w:t>
-      </w:r>
-    </w:p>
-    <w:bookmarkStart w:id="51" w:name="scolarisation-des-individus"/>
-    <w:p>
-      <w:pPr>
-        <w:pStyle w:val="Heading4"/>
-      </w:pPr>
-      <w:r>
-        <w:t xml:space="preserve">Scolarisation des individus</w:t>
-      </w:r>
-    </w:p>
-    <w:p>
-      <w:pPr>
-        <w:pStyle w:val="TableCaption"/>
-      </w:pPr>
-      <w:r>
-        <w:t xml:space="preserve">Taux de scolarisation par tranche d’âge scolaire</w:t>
-      </w:r>
-    </w:p>
-    <w:tbl>
-      <w:tblPr>
-        <w:tblStyle w:val="Table"/>
-        <w:tblW w:type="auto" w:w="0"/>
-        <w:tblLook w:firstRow="1" w:lastRow="0" w:firstColumn="0" w:lastColumn="0" w:noHBand="0" w:noVBand="0" w:val="0020"/>
-        <w:tblCaption w:val="Taux de scolarisation par tranche d’âge scolaire"/>
-      </w:tblPr>
-      <w:tblGrid>
-        <w:gridCol w:w="2640"/>
-        <w:gridCol w:w="2640"/>
-        <w:gridCol w:w="2640"/>
-      </w:tblGrid>
-      <w:tr>
-        <w:trPr>
-          <w:tblHeader w:val="on"/>
-        </w:trPr>
-        <w:tc>
-          <w:tcPr/>
-          <w:p>
-            <w:pPr>
-              <w:pStyle w:val="Compact"/>
-              <w:jc w:val="left"/>
-            </w:pPr>
-            <w:r>
-              <w:t xml:space="preserve">Tranche</w:t>
-            </w:r>
-          </w:p>
-        </w:tc>
-        <w:tc>
-          <w:tcPr/>
-          <w:p>
-            <w:pPr>
-              <w:pStyle w:val="Compact"/>
-              <w:jc w:val="right"/>
-            </w:pPr>
-            <w:r>
-              <w:t xml:space="preserve">Taux scolarisation (%)</w:t>
-            </w:r>
-          </w:p>
-        </w:tc>
-        <w:tc>
-          <w:tcPr/>
-          <w:p>
-            <w:pPr>
-              <w:pStyle w:val="Compact"/>
-              <w:jc w:val="right"/>
-            </w:pPr>
-            <w:r>
-              <w:t xml:space="preserve">Total</w:t>
-            </w:r>
-          </w:p>
-        </w:tc>
-      </w:tr>
-      <w:tr>
-        <w:tc>
-          <w:tcPr/>
-          <w:p>
-            <w:pPr>
-              <w:pStyle w:val="Compact"/>
-              <w:jc w:val="left"/>
-            </w:pPr>
-            <w:r>
-              <w:t xml:space="preserve">Moyen (12-15 ans)</w:t>
-            </w:r>
-          </w:p>
-        </w:tc>
-        <w:tc>
-          <w:tcPr/>
-          <w:p>
-            <w:pPr>
-              <w:pStyle w:val="Compact"/>
-              <w:jc w:val="right"/>
-            </w:pPr>
-            <w:r>
-              <w:t xml:space="preserve">69.9</w:t>
-            </w:r>
-          </w:p>
-        </w:tc>
-        <w:tc>
-          <w:tcPr/>
-          <w:p>
-            <w:pPr>
-              <w:pStyle w:val="Compact"/>
-              <w:jc w:val="right"/>
-            </w:pPr>
-            <w:r>
-              <w:t xml:space="preserve">1805</w:t>
-            </w:r>
-          </w:p>
-        </w:tc>
-      </w:tr>
-      <w:tr>
-        <w:tc>
-          <w:tcPr/>
-          <w:p>
-            <w:pPr>
-              <w:pStyle w:val="Compact"/>
-              <w:jc w:val="left"/>
-            </w:pPr>
-            <w:r>
-              <w:t xml:space="preserve">Primaire (6-11 ans)</w:t>
-            </w:r>
-          </w:p>
-        </w:tc>
-        <w:tc>
-          <w:tcPr/>
-          <w:p>
-            <w:pPr>
-              <w:pStyle w:val="Compact"/>
-              <w:jc w:val="right"/>
-            </w:pPr>
-            <w:r>
-              <w:t xml:space="preserve">52.3</w:t>
-            </w:r>
-          </w:p>
-        </w:tc>
-        <w:tc>
-          <w:tcPr/>
-          <w:p>
-            <w:pPr>
-              <w:pStyle w:val="Compact"/>
-              <w:jc w:val="right"/>
-            </w:pPr>
-            <w:r>
-              <w:t xml:space="preserve">3255</w:t>
-            </w:r>
-          </w:p>
-        </w:tc>
-      </w:tr>
-    </w:tbl>
-    <w:p>
-      <w:pPr>
-        <w:pStyle w:val="BodyText"/>
-      </w:pPr>
-      <w:r>
-        <w:drawing>
-          <wp:inline>
-            <wp:extent cx="5334000" cy="3556000"/>
-            <wp:effectExtent b="0" l="0" r="0" t="0"/>
-            <wp:docPr descr="" title="" id="49" name="Picture"/>
-            <a:graphic>
-              <a:graphicData uri="http://schemas.openxmlformats.org/drawingml/2006/picture">
-                <pic:pic>
-                  <pic:nvPicPr>
-                    <pic:cNvPr descr="C:\Users\USER\Documents\ENSAE\ISE3\traitements des données statistiques\Projet_Traitement_Analyse\PUDC_Pipeline\data\output\QAQC_Report_files/fdb59153f5ecfa6c75964251c669a339d8f76c35.png" id="50" name="Picture"/>
-                    <pic:cNvPicPr>
-                      <a:picLocks noChangeArrowheads="1" noChangeAspect="1"/>
-                    </pic:cNvPicPr>
-                  </pic:nvPicPr>
-                  <pic:blipFill>
-                    <a:blip r:embed="rId48"/>
-                    <a:stretch>
-                      <a:fillRect/>
-                    </a:stretch>
-                  </pic:blipFill>
-                  <pic:spPr bwMode="auto">
-                    <a:xfrm>
-                      <a:off x="0" y="0"/>
-                      <a:ext cx="5334000" cy="3556000"/>
-                    </a:xfrm>
-                    <a:prstGeom prst="rect">
-                      <a:avLst/>
-                    </a:prstGeom>
-                    <a:noFill/>
-                    <a:ln w="9525">
-                      <a:noFill/>
-                      <a:headEnd/>
-                      <a:tailEnd/>
-                    </a:ln>
-                  </pic:spPr>
-                </pic:pic>
-              </a:graphicData>
-            </a:graphic>
-          </wp:inline>
-        </w:drawing>
-      </w:r>
-    </w:p>
-    <w:bookmarkEnd w:id="51"/>
-    <w:bookmarkStart w:id="52" w:name="profil-du-chef-de-ménage"/>
-    <w:p>
-      <w:pPr>
-        <w:pStyle w:val="Heading4"/>
-      </w:pPr>
-      <w:r>
-        <w:t xml:space="preserve">Profil du Chef de Ménage</w:t>
-      </w:r>
-    </w:p>
-    <w:p>
-      <w:pPr>
-        <w:pStyle w:val="TableCaption"/>
-      </w:pPr>
-      <w:r>
-        <w:t xml:space="preserve">Profil sociodémographique des Chefs de Ménage</w:t>
-      </w:r>
-    </w:p>
-    <w:tbl>
-      <w:tblPr>
-        <w:tblStyle w:val="Table"/>
-        <w:tblW w:type="auto" w:w="0"/>
-        <w:tblLook w:firstRow="1" w:lastRow="0" w:firstColumn="0" w:lastColumn="0" w:noHBand="0" w:noVBand="0" w:val="0020"/>
-        <w:tblCaption w:val="Profil sociodémographique des Chefs de Ménage"/>
-      </w:tblPr>
-      <w:tblGrid>
-        <w:gridCol w:w="3960"/>
-        <w:gridCol w:w="3960"/>
-      </w:tblGrid>
-      <w:tr>
-        <w:trPr>
-          <w:tblHeader w:val="on"/>
-        </w:trPr>
-        <w:tc>
-          <w:tcPr/>
-          <w:p>
-            <w:pPr>
-              <w:pStyle w:val="Compact"/>
-              <w:jc w:val="left"/>
-            </w:pPr>
-            <w:r>
-              <w:t xml:space="preserve">Indicateur</w:t>
-            </w:r>
-          </w:p>
-        </w:tc>
-        <w:tc>
-          <w:tcPr/>
-          <w:p>
-            <w:pPr>
-              <w:pStyle w:val="Compact"/>
-              <w:jc w:val="right"/>
-            </w:pPr>
-            <w:r>
-              <w:t xml:space="preserve">Valeur</w:t>
-            </w:r>
-          </w:p>
-        </w:tc>
-      </w:tr>
-      <w:tr>
-        <w:tc>
-          <w:tcPr/>
-          <w:p>
-            <w:pPr>
-              <w:pStyle w:val="Compact"/>
-              <w:jc w:val="left"/>
-            </w:pPr>
-            <w:r>
-              <w:t xml:space="preserve">Âge moyen du Chef de Ménage</w:t>
-            </w:r>
-          </w:p>
-        </w:tc>
-        <w:tc>
-          <w:tcPr/>
-          <w:p>
-            <w:pPr>
-              <w:pStyle w:val="Compact"/>
-              <w:jc w:val="right"/>
-            </w:pPr>
-            <w:r>
-              <w:t xml:space="preserve">54.3</w:t>
-            </w:r>
-          </w:p>
-        </w:tc>
-      </w:tr>
-      <w:tr>
-        <w:tc>
-          <w:tcPr/>
-          <w:p>
-            <w:pPr>
-              <w:pStyle w:val="Compact"/>
-              <w:jc w:val="left"/>
-            </w:pPr>
-            <w:r>
-              <w:t xml:space="preserve">Proportion de femmes Chefs de Ménage (%)</w:t>
-            </w:r>
-          </w:p>
-        </w:tc>
-        <w:tc>
-          <w:tcPr/>
-          <w:p>
-            <w:pPr>
-              <w:pStyle w:val="Compact"/>
-              <w:jc w:val="right"/>
-            </w:pPr>
-            <w:r>
-              <w:t xml:space="preserve">17.0</w:t>
-            </w:r>
-          </w:p>
-        </w:tc>
-      </w:tr>
-      <w:tr>
-        <w:tc>
-          <w:tcPr/>
-          <w:p>
-            <w:pPr>
-              <w:pStyle w:val="Compact"/>
-              <w:jc w:val="left"/>
-            </w:pPr>
-            <w:r>
-              <w:t xml:space="preserve">Taux de scolarisation du Chef de Ménage (%)</w:t>
-            </w:r>
-          </w:p>
-        </w:tc>
-        <w:tc>
-          <w:tcPr/>
-          <w:p>
-            <w:pPr>
-              <w:pStyle w:val="Compact"/>
-              <w:jc w:val="right"/>
-            </w:pPr>
-            <w:r>
-              <w:t xml:space="preserve">25.5</w:t>
-            </w:r>
-          </w:p>
-        </w:tc>
-      </w:tr>
-    </w:tbl>
-    <w:bookmarkEnd w:id="52"/>
-    <w:bookmarkEnd w:id="53"/>
-    <w:bookmarkStart w:id="56" w:name="caractéristiques-du-logement-et-emploi"/>
-    <w:p>
-      <w:pPr>
-        <w:pStyle w:val="Heading3"/>
-      </w:pPr>
-      <w:r>
-        <w:t xml:space="preserve">Caractéristiques du Logement et Emploi</w:t>
-      </w:r>
-    </w:p>
-    <w:bookmarkStart w:id="54" w:name="matériaux-de-construction"/>
-    <w:p>
-      <w:pPr>
-        <w:pStyle w:val="Heading4"/>
-      </w:pPr>
-      <w:r>
-        <w:t xml:space="preserve">Matériaux de construction</w:t>
-      </w:r>
-    </w:p>
-    <w:p>
-      <w:pPr>
-        <w:pStyle w:val="TableCaption"/>
-      </w:pPr>
-      <w:r>
-        <w:t xml:space="preserve">Qualité de construction du logement</w:t>
-      </w:r>
-    </w:p>
-    <w:tbl>
-      <w:tblPr>
-        <w:tblStyle w:val="Table"/>
-        <w:tblW w:type="auto" w:w="0"/>
-        <w:tblLook w:firstRow="1" w:lastRow="0" w:firstColumn="0" w:lastColumn="0" w:noHBand="0" w:noVBand="0" w:val="0020"/>
-        <w:tblCaption w:val="Qualité de construction du logement"/>
-      </w:tblPr>
-      <w:tblGrid>
-        <w:gridCol w:w="3960"/>
-        <w:gridCol w:w="3960"/>
-      </w:tblGrid>
-      <w:tr>
-        <w:trPr>
-          <w:tblHeader w:val="on"/>
-        </w:trPr>
-        <w:tc>
-          <w:tcPr/>
-          <w:p>
-            <w:pPr>
-              <w:pStyle w:val="Compact"/>
-              <w:jc w:val="left"/>
-            </w:pPr>
-            <w:r>
-              <w:t xml:space="preserve">Indicateur</w:t>
-            </w:r>
-          </w:p>
-        </w:tc>
-        <w:tc>
-          <w:tcPr/>
-          <w:p>
-            <w:pPr>
-              <w:pStyle w:val="Compact"/>
-              <w:jc w:val="right"/>
-            </w:pPr>
-            <w:r>
-              <w:t xml:space="preserve">Proportion</w:t>
-            </w:r>
-          </w:p>
-        </w:tc>
-      </w:tr>
-      <w:tr>
-        <w:tc>
-          <w:tcPr/>
-          <w:p>
-            <w:pPr>
-              <w:pStyle w:val="Compact"/>
-              <w:jc w:val="left"/>
-            </w:pPr>
-            <w:r>
-              <w:t xml:space="preserve">Toit (matériaux améliorés) (%)</w:t>
-            </w:r>
-          </w:p>
-        </w:tc>
-        <w:tc>
-          <w:tcPr/>
-          <w:p>
-            <w:pPr>
-              <w:pStyle w:val="Compact"/>
-              <w:jc w:val="right"/>
-            </w:pPr>
-            <w:r>
-              <w:t xml:space="preserve">88.4</w:t>
-            </w:r>
-          </w:p>
-        </w:tc>
-      </w:tr>
-      <w:tr>
-        <w:tc>
-          <w:tcPr/>
-          <w:p>
-            <w:pPr>
-              <w:pStyle w:val="Compact"/>
-              <w:jc w:val="left"/>
-            </w:pPr>
-            <w:r>
-              <w:t xml:space="preserve">Murs (matériaux améliorés) (%)</w:t>
-            </w:r>
-          </w:p>
-        </w:tc>
-        <w:tc>
-          <w:tcPr/>
-          <w:p>
-            <w:pPr>
-              <w:pStyle w:val="Compact"/>
-              <w:jc w:val="right"/>
-            </w:pPr>
-            <w:r>
-              <w:t xml:space="preserve">71.1</w:t>
-            </w:r>
-          </w:p>
-        </w:tc>
-      </w:tr>
-    </w:tbl>
-    <w:bookmarkEnd w:id="54"/>
-    <w:bookmarkStart w:id="55" w:name="emploi-et-occupation"/>
-    <w:p>
-      <w:pPr>
-        <w:pStyle w:val="Heading4"/>
-      </w:pPr>
-      <w:r>
-        <w:t xml:space="preserve">Emploi et Occupation</w:t>
-      </w:r>
-    </w:p>
-    <w:p>
-      <w:pPr>
-        <w:pStyle w:val="TableCaption"/>
-      </w:pPr>
-      <w:r>
-        <w:t xml:space="preserve">Répartition de la population par statut d’occupation</w:t>
-      </w:r>
-    </w:p>
-    <w:tbl>
-      <w:tblPr>
-        <w:tblStyle w:val="Table"/>
-        <w:tblW w:type="auto" w:w="0"/>
-        <w:tblLook w:firstRow="1" w:lastRow="0" w:firstColumn="0" w:lastColumn="0" w:noHBand="0" w:noVBand="0" w:val="0020"/>
-        <w:tblCaption w:val="Répartition de la population par statut d’occupation"/>
-      </w:tblPr>
-      <w:tblGrid>
-        <w:gridCol w:w="2640"/>
-        <w:gridCol w:w="2640"/>
-        <w:gridCol w:w="2640"/>
-      </w:tblGrid>
-      <w:tr>
-        <w:trPr>
-          <w:tblHeader w:val="on"/>
-        </w:trPr>
-        <w:tc>
-          <w:tcPr/>
-          <w:p>
-            <w:pPr>
-              <w:pStyle w:val="Compact"/>
-              <w:jc w:val="right"/>
-            </w:pPr>
-            <w:r>
-              <w:t xml:space="preserve">occupation</w:t>
-            </w:r>
-          </w:p>
-        </w:tc>
-        <w:tc>
-          <w:tcPr/>
-          <w:p>
-            <w:pPr>
-              <w:pStyle w:val="Compact"/>
-              <w:jc w:val="right"/>
-            </w:pPr>
-            <w:r>
-              <w:t xml:space="preserve">Effectif</w:t>
-            </w:r>
-          </w:p>
-        </w:tc>
-        <w:tc>
-          <w:tcPr/>
-          <w:p>
-            <w:pPr>
-              <w:pStyle w:val="Compact"/>
-              <w:jc w:val="right"/>
-            </w:pPr>
-            <w:r>
-              <w:t xml:space="preserve">Proportion</w:t>
-            </w:r>
-          </w:p>
-        </w:tc>
-      </w:tr>
-      <w:tr>
-        <w:tc>
-          <w:tcPr/>
-          <w:p>
-            <w:pPr>
-              <w:pStyle w:val="Compact"/>
-              <w:jc w:val="right"/>
-            </w:pPr>
-            <w:r>
-              <w:t xml:space="preserve">0</w:t>
-            </w:r>
-          </w:p>
-        </w:tc>
-        <w:tc>
-          <w:tcPr/>
-          <w:p>
-            <w:pPr>
-              <w:pStyle w:val="Compact"/>
-              <w:jc w:val="right"/>
-            </w:pPr>
-            <w:r>
-              <w:t xml:space="preserve">7683</w:t>
-            </w:r>
-          </w:p>
-        </w:tc>
-        <w:tc>
-          <w:tcPr/>
-          <w:p>
-            <w:pPr>
-              <w:pStyle w:val="Compact"/>
-              <w:jc w:val="right"/>
-            </w:pPr>
-            <w:r>
-              <w:t xml:space="preserve">60.2</w:t>
-            </w:r>
-          </w:p>
-        </w:tc>
-      </w:tr>
-      <w:tr>
-        <w:tc>
-          <w:tcPr/>
-          <w:p>
-            <w:pPr>
-              <w:pStyle w:val="Compact"/>
-              <w:jc w:val="right"/>
-            </w:pPr>
-            <w:r>
-              <w:t xml:space="preserve">1</w:t>
-            </w:r>
-          </w:p>
-        </w:tc>
-        <w:tc>
-          <w:tcPr/>
-          <w:p>
-            <w:pPr>
-              <w:pStyle w:val="Compact"/>
-              <w:jc w:val="right"/>
-            </w:pPr>
-            <w:r>
-              <w:t xml:space="preserve">92</w:t>
-            </w:r>
-          </w:p>
-        </w:tc>
-        <w:tc>
-          <w:tcPr/>
-          <w:p>
-            <w:pPr>
-              <w:pStyle w:val="Compact"/>
-              <w:jc w:val="right"/>
-            </w:pPr>
-            <w:r>
-              <w:t xml:space="preserve">0.7</w:t>
-            </w:r>
-          </w:p>
-        </w:tc>
-      </w:tr>
-      <w:tr>
-        <w:tc>
-          <w:tcPr/>
-          <w:p>
-            <w:pPr>
-              <w:pStyle w:val="Compact"/>
-              <w:jc w:val="right"/>
-            </w:pPr>
-            <w:r>
-              <w:t xml:space="preserve">2</w:t>
-            </w:r>
-          </w:p>
-        </w:tc>
-        <w:tc>
-          <w:tcPr/>
-          <w:p>
-            <w:pPr>
-              <w:pStyle w:val="Compact"/>
-              <w:jc w:val="right"/>
-            </w:pPr>
-            <w:r>
-              <w:t xml:space="preserve">9</w:t>
-            </w:r>
-          </w:p>
-        </w:tc>
-        <w:tc>
-          <w:tcPr/>
-          <w:p>
-            <w:pPr>
-              <w:pStyle w:val="Compact"/>
-              <w:jc w:val="right"/>
-            </w:pPr>
-            <w:r>
-              <w:t xml:space="preserve">0.1</w:t>
-            </w:r>
-          </w:p>
-        </w:tc>
-      </w:tr>
-      <w:tr>
-        <w:tc>
-          <w:tcPr/>
-          <w:p>
-            <w:pPr>
-              <w:pStyle w:val="Compact"/>
-              <w:jc w:val="right"/>
-            </w:pPr>
-            <w:r>
-              <w:t xml:space="preserve">3</w:t>
-            </w:r>
-          </w:p>
-        </w:tc>
-        <w:tc>
-          <w:tcPr/>
-          <w:p>
-            <w:pPr>
-              <w:pStyle w:val="Compact"/>
-              <w:jc w:val="right"/>
-            </w:pPr>
-            <w:r>
-              <w:t xml:space="preserve">54</w:t>
-            </w:r>
-          </w:p>
-        </w:tc>
-        <w:tc>
-          <w:tcPr/>
-          <w:p>
-            <w:pPr>
-              <w:pStyle w:val="Compact"/>
-              <w:jc w:val="right"/>
-            </w:pPr>
-            <w:r>
-              <w:t xml:space="preserve">0.4</w:t>
-            </w:r>
-          </w:p>
-        </w:tc>
-      </w:tr>
-      <w:tr>
-        <w:tc>
-          <w:tcPr/>
-          <w:p>
-            <w:pPr>
-              <w:pStyle w:val="Compact"/>
-              <w:jc w:val="right"/>
-            </w:pPr>
-            <w:r>
-              <w:t xml:space="preserve">4</w:t>
-            </w:r>
-          </w:p>
-        </w:tc>
-        <w:tc>
-          <w:tcPr/>
-          <w:p>
-            <w:pPr>
-              <w:pStyle w:val="Compact"/>
-              <w:jc w:val="right"/>
-            </w:pPr>
-            <w:r>
-              <w:t xml:space="preserve">125</w:t>
-            </w:r>
-          </w:p>
-        </w:tc>
-        <w:tc>
-          <w:tcPr/>
-          <w:p>
-            <w:pPr>
-              <w:pStyle w:val="Compact"/>
-              <w:jc w:val="right"/>
-            </w:pPr>
-            <w:r>
-              <w:t xml:space="preserve">1.0</w:t>
-            </w:r>
-          </w:p>
-        </w:tc>
-      </w:tr>
-      <w:tr>
-        <w:tc>
-          <w:tcPr/>
-          <w:p>
-            <w:pPr>
-              <w:pStyle w:val="Compact"/>
-              <w:jc w:val="right"/>
-            </w:pPr>
-            <w:r>
-              <w:t xml:space="preserve">5</w:t>
-            </w:r>
-          </w:p>
-        </w:tc>
-        <w:tc>
-          <w:tcPr/>
-          <w:p>
-            <w:pPr>
-              <w:pStyle w:val="Compact"/>
-              <w:jc w:val="right"/>
-            </w:pPr>
-            <w:r>
-              <w:t xml:space="preserve">99</w:t>
-            </w:r>
-          </w:p>
-        </w:tc>
-        <w:tc>
-          <w:tcPr/>
-          <w:p>
-            <w:pPr>
-              <w:pStyle w:val="Compact"/>
-              <w:jc w:val="right"/>
-            </w:pPr>
-            <w:r>
-              <w:t xml:space="preserve">0.8</w:t>
-            </w:r>
-          </w:p>
-        </w:tc>
-      </w:tr>
-      <w:tr>
-        <w:tc>
-          <w:tcPr/>
-          <w:p>
-            <w:pPr>
-              <w:pStyle w:val="Compact"/>
-              <w:jc w:val="right"/>
-            </w:pPr>
-            <w:r>
-              <w:t xml:space="preserve">6</w:t>
-            </w:r>
-          </w:p>
-        </w:tc>
-        <w:tc>
-          <w:tcPr/>
-          <w:p>
-            <w:pPr>
-              <w:pStyle w:val="Compact"/>
-              <w:jc w:val="right"/>
-            </w:pPr>
-            <w:r>
-              <w:t xml:space="preserve">147</w:t>
-            </w:r>
-          </w:p>
-        </w:tc>
-        <w:tc>
-          <w:tcPr/>
-          <w:p>
-            <w:pPr>
-              <w:pStyle w:val="Compact"/>
-              <w:jc w:val="right"/>
-            </w:pPr>
-            <w:r>
-              <w:t xml:space="preserve">1.2</w:t>
-            </w:r>
-          </w:p>
-        </w:tc>
-      </w:tr>
-      <w:tr>
-        <w:tc>
-          <w:tcPr/>
-          <w:p>
-            <w:pPr>
-              <w:pStyle w:val="Compact"/>
-              <w:jc w:val="right"/>
-            </w:pPr>
-            <w:r>
-              <w:t xml:space="preserve">7</w:t>
-            </w:r>
-          </w:p>
-        </w:tc>
-        <w:tc>
-          <w:tcPr/>
-          <w:p>
-            <w:pPr>
-              <w:pStyle w:val="Compact"/>
-              <w:jc w:val="right"/>
-            </w:pPr>
-            <w:r>
-              <w:t xml:space="preserve">33</w:t>
-            </w:r>
-          </w:p>
-        </w:tc>
-        <w:tc>
-          <w:tcPr/>
-          <w:p>
-            <w:pPr>
-              <w:pStyle w:val="Compact"/>
-              <w:jc w:val="right"/>
-            </w:pPr>
-            <w:r>
-              <w:t xml:space="preserve">0.3</w:t>
-            </w:r>
-          </w:p>
-        </w:tc>
-      </w:tr>
-      <w:tr>
-        <w:tc>
-          <w:tcPr/>
-          <w:p>
-            <w:pPr>
-              <w:pStyle w:val="Compact"/>
-              <w:jc w:val="right"/>
-            </w:pPr>
-            <w:r>
-              <w:t xml:space="preserve">8</w:t>
-            </w:r>
-          </w:p>
-        </w:tc>
-        <w:tc>
-          <w:tcPr/>
-          <w:p>
-            <w:pPr>
-              <w:pStyle w:val="Compact"/>
-              <w:jc w:val="right"/>
-            </w:pPr>
-            <w:r>
-              <w:t xml:space="preserve">2083</w:t>
-            </w:r>
-          </w:p>
-        </w:tc>
-        <w:tc>
-          <w:tcPr/>
-          <w:p>
-            <w:pPr>
-              <w:pStyle w:val="Compact"/>
-              <w:jc w:val="right"/>
-            </w:pPr>
-            <w:r>
-              <w:t xml:space="preserve">16.3</w:t>
-            </w:r>
-          </w:p>
-        </w:tc>
-      </w:tr>
-      <w:tr>
-        <w:tc>
-          <w:tcPr/>
-          <w:p>
-            <w:pPr>
-              <w:pStyle w:val="Compact"/>
-              <w:jc w:val="right"/>
-            </w:pPr>
-            <w:r>
-              <w:t xml:space="preserve">9</w:t>
-            </w:r>
-          </w:p>
-        </w:tc>
-        <w:tc>
-          <w:tcPr/>
-          <w:p>
-            <w:pPr>
-              <w:pStyle w:val="Compact"/>
-              <w:jc w:val="right"/>
-            </w:pPr>
-            <w:r>
-              <w:t xml:space="preserve">468</w:t>
-            </w:r>
-          </w:p>
-        </w:tc>
-        <w:tc>
-          <w:tcPr/>
-          <w:p>
-            <w:pPr>
-              <w:pStyle w:val="Compact"/>
-              <w:jc w:val="right"/>
-            </w:pPr>
-            <w:r>
-              <w:t xml:space="preserve">3.7</w:t>
-            </w:r>
-          </w:p>
-        </w:tc>
-      </w:tr>
-      <w:tr>
-        <w:tc>
-          <w:tcPr/>
-          <w:p>
-            <w:pPr>
-              <w:pStyle w:val="Compact"/>
-              <w:jc w:val="right"/>
-            </w:pPr>
-            <w:r>
-              <w:t xml:space="preserve">10</w:t>
-            </w:r>
-          </w:p>
-        </w:tc>
-        <w:tc>
-          <w:tcPr/>
-          <w:p>
-            <w:pPr>
-              <w:pStyle w:val="Compact"/>
-              <w:jc w:val="right"/>
-            </w:pPr>
-            <w:r>
-              <w:t xml:space="preserve">1361</w:t>
-            </w:r>
-          </w:p>
-        </w:tc>
-        <w:tc>
-          <w:tcPr/>
-          <w:p>
-            <w:pPr>
-              <w:pStyle w:val="Compact"/>
-              <w:jc w:val="right"/>
-            </w:pPr>
-            <w:r>
-              <w:t xml:space="preserve">10.7</w:t>
-            </w:r>
-          </w:p>
-        </w:tc>
-      </w:tr>
-      <w:tr>
-        <w:tc>
-          <w:tcPr/>
-          <w:p>
-            <w:pPr>
-              <w:pStyle w:val="Compact"/>
-              <w:jc w:val="right"/>
-            </w:pPr>
-            <w:r>
-              <w:t xml:space="preserve">11</w:t>
-            </w:r>
-          </w:p>
-        </w:tc>
-        <w:tc>
-          <w:tcPr/>
-          <w:p>
-            <w:pPr>
-              <w:pStyle w:val="Compact"/>
-              <w:jc w:val="right"/>
-            </w:pPr>
-            <w:r>
-              <w:t xml:space="preserve">105</w:t>
-            </w:r>
-          </w:p>
-        </w:tc>
-        <w:tc>
-          <w:tcPr/>
-          <w:p>
-            <w:pPr>
-              <w:pStyle w:val="Compact"/>
-              <w:jc w:val="right"/>
-            </w:pPr>
-            <w:r>
-              <w:t xml:space="preserve">0.8</w:t>
-            </w:r>
-          </w:p>
-        </w:tc>
-      </w:tr>
-      <w:tr>
-        <w:tc>
-          <w:tcPr/>
-          <w:p>
-            <w:pPr>
-              <w:pStyle w:val="Compact"/>
-              <w:jc w:val="right"/>
-            </w:pPr>
-            <w:r>
-              <w:t xml:space="preserve">12</w:t>
-            </w:r>
-          </w:p>
-        </w:tc>
-        <w:tc>
-          <w:tcPr/>
-          <w:p>
-            <w:pPr>
-              <w:pStyle w:val="Compact"/>
-              <w:jc w:val="right"/>
-            </w:pPr>
-            <w:r>
-              <w:t xml:space="preserve">500</w:t>
-            </w:r>
-          </w:p>
-        </w:tc>
-        <w:tc>
-          <w:tcPr/>
-          <w:p>
-            <w:pPr>
-              <w:pStyle w:val="Compact"/>
-              <w:jc w:val="right"/>
-            </w:pPr>
-            <w:r>
-              <w:t xml:space="preserve">3.9</w:t>
-            </w:r>
-          </w:p>
-        </w:tc>
-      </w:tr>
-    </w:tbl>
-    <w:bookmarkEnd w:id="55"/>
-    <w:bookmarkEnd w:id="56"/>
-    <w:bookmarkStart w:id="61" w:name="actifs-possédés-et-sources-de-revenus"/>
-    <w:p>
-      <w:pPr>
-        <w:pStyle w:val="Heading3"/>
-      </w:pPr>
-      <w:r>
-        <w:t xml:space="preserve">Actifs possédés et Sources de Revenus</w:t>
-      </w:r>
-    </w:p>
-    <w:bookmarkStart w:id="60" w:name="possession-des-actifs-détail"/>
-    <w:p>
-      <w:pPr>
-        <w:pStyle w:val="Heading4"/>
-      </w:pPr>
-      <w:r>
-        <w:t xml:space="preserve">Possession des actifs (Détail)</w:t>
-      </w:r>
-    </w:p>
-    <w:p>
-      <w:pPr>
-        <w:pStyle w:val="FirstParagraph"/>
-      </w:pPr>
-      <w:r>
-        <w:drawing>
-          <wp:inline>
-            <wp:extent cx="5334000" cy="3333750"/>
-            <wp:effectExtent b="0" l="0" r="0" t="0"/>
-            <wp:docPr descr="" title="" id="58" name="Picture"/>
-            <a:graphic>
-              <a:graphicData uri="http://schemas.openxmlformats.org/drawingml/2006/picture">
-                <pic:pic>
-                  <pic:nvPicPr>
-                    <pic:cNvPr descr="C:\Users\USER\Documents\ENSAE\ISE3\traitements des données statistiques\Projet_Traitement_Analyse\PUDC_Pipeline\data\output\QAQC_Report_files/14d8351113a94df9b9fa186349177ff6f049ffaa.png" id="59" name="Picture"/>
-                    <pic:cNvPicPr>
-                      <a:picLocks noChangeArrowheads="1" noChangeAspect="1"/>
-                    </pic:cNvPicPr>
-                  </pic:nvPicPr>
-                  <pic:blipFill>
-                    <a:blip r:embed="rId57"/>
+                    <a:blip r:embed="rId66"/>
                     <a:stretch>
                       <a:fillRect/>
                     </a:stretch>
@@ -4349,381 +4643,19 @@
         </w:drawing>
       </w:r>
     </w:p>
-    <w:bookmarkEnd w:id="60"/>
-    <w:bookmarkEnd w:id="61"/>
-    <w:bookmarkStart w:id="69" w:name="Xcdd1a43f1baf159117e1f730194057bacaed1fd"/>
+    <w:bookmarkEnd w:id="69"/>
+    <w:bookmarkStart w:id="73" w:name="index-de-richesse-par-région"/>
     <w:p>
       <w:pPr>
         <w:pStyle w:val="Heading3"/>
       </w:pPr>
       <w:r>
-        <w:t xml:space="preserve">Index de Richesse (Analyse en Composantes Principales - ACP)</w:t>
+        <w:t xml:space="preserve">Index de richesse par région</w:t>
       </w:r>
     </w:p>
     <w:p>
       <w:pPr>
         <w:pStyle w:val="FirstParagraph"/>
-      </w:pPr>
-      <w:r>
-        <w:t xml:space="preserve">L’indice de richesse a été construit en utilisant une ACP sur la base de la possession de plusieurs actifs.</w:t>
-      </w:r>
-    </w:p>
-    <w:p>
-      <w:pPr>
-        <w:pStyle w:val="TableCaption"/>
-      </w:pPr>
-      <w:r>
-        <w:t xml:space="preserve">Indicateurs de richesse et conditions de logement</w:t>
-      </w:r>
-    </w:p>
-    <w:tbl>
-      <w:tblPr>
-        <w:tblStyle w:val="Table"/>
-        <w:tblW w:type="auto" w:w="0"/>
-        <w:tblLook w:firstRow="1" w:lastRow="0" w:firstColumn="0" w:lastColumn="0" w:noHBand="0" w:noVBand="0" w:val="0020"/>
-        <w:tblCaption w:val="Indicateurs de richesse et conditions de logement"/>
-      </w:tblPr>
-      <w:tblGrid>
-        <w:gridCol w:w="3960"/>
-        <w:gridCol w:w="3960"/>
-      </w:tblGrid>
-      <w:tr>
-        <w:trPr>
-          <w:tblHeader w:val="on"/>
-        </w:trPr>
-        <w:tc>
-          <w:tcPr/>
-          <w:p>
-            <w:pPr>
-              <w:pStyle w:val="Compact"/>
-              <w:jc w:val="left"/>
-            </w:pPr>
-            <w:r>
-              <w:t xml:space="preserve">Indicateur</w:t>
-            </w:r>
-          </w:p>
-        </w:tc>
-        <w:tc>
-          <w:tcPr/>
-          <w:p>
-            <w:pPr>
-              <w:pStyle w:val="Compact"/>
-              <w:jc w:val="left"/>
-            </w:pPr>
-            <w:r>
-              <w:t xml:space="preserve">Valeur</w:t>
-            </w:r>
-          </w:p>
-        </w:tc>
-      </w:tr>
-      <w:tr>
-        <w:tc>
-          <w:tcPr/>
-          <w:p>
-            <w:pPr>
-              <w:pStyle w:val="Compact"/>
-              <w:jc w:val="left"/>
-            </w:pPr>
-            <w:r>
-              <w:t xml:space="preserve">Score moyen d’actifs (non pondéré)</w:t>
-            </w:r>
-          </w:p>
-        </w:tc>
-        <w:tc>
-          <w:tcPr/>
-          <w:p>
-            <w:pPr>
-              <w:pStyle w:val="Compact"/>
-              <w:jc w:val="left"/>
-            </w:pPr>
-            <w:r>
-              <w:t xml:space="preserve">2.37</w:t>
-            </w:r>
-          </w:p>
-        </w:tc>
-      </w:tr>
-      <w:tr>
-        <w:tc>
-          <w:tcPr/>
-          <w:p>
-            <w:pPr>
-              <w:pStyle w:val="Compact"/>
-              <w:jc w:val="left"/>
-            </w:pPr>
-            <w:r>
-              <w:t xml:space="preserve">Index Richesse ACP (Moyenne)</w:t>
-            </w:r>
-          </w:p>
-        </w:tc>
-        <w:tc>
-          <w:tcPr/>
-          <w:p>
-            <w:pPr>
-              <w:pStyle w:val="Compact"/>
-              <w:jc w:val="left"/>
-            </w:pPr>
-            <w:r>
-              <w:t xml:space="preserve">0</w:t>
-            </w:r>
-          </w:p>
-        </w:tc>
-      </w:tr>
-      <w:tr>
-        <w:tc>
-          <w:tcPr/>
-          <w:p>
-            <w:pPr>
-              <w:pStyle w:val="Compact"/>
-              <w:jc w:val="left"/>
-            </w:pPr>
-            <w:r>
-              <w:t xml:space="preserve">Index Richesse ACP (Min)</w:t>
-            </w:r>
-          </w:p>
-        </w:tc>
-        <w:tc>
-          <w:tcPr/>
-          <w:p>
-            <w:pPr>
-              <w:pStyle w:val="Compact"/>
-              <w:jc w:val="left"/>
-            </w:pPr>
-            <w:r>
-              <w:t xml:space="preserve">-0.99</w:t>
-            </w:r>
-          </w:p>
-        </w:tc>
-      </w:tr>
-      <w:tr>
-        <w:tc>
-          <w:tcPr/>
-          <w:p>
-            <w:pPr>
-              <w:pStyle w:val="Compact"/>
-              <w:jc w:val="left"/>
-            </w:pPr>
-            <w:r>
-              <w:t xml:space="preserve">Index Richesse ACP (Max)</w:t>
-            </w:r>
-          </w:p>
-        </w:tc>
-        <w:tc>
-          <w:tcPr/>
-          <w:p>
-            <w:pPr>
-              <w:pStyle w:val="Compact"/>
-              <w:jc w:val="left"/>
-            </w:pPr>
-            <w:r>
-              <w:t xml:space="preserve">14.39</w:t>
-            </w:r>
-          </w:p>
-        </w:tc>
-      </w:tr>
-      <w:tr>
-        <w:tc>
-          <w:tcPr/>
-          <w:p>
-            <w:pPr>
-              <w:pStyle w:val="Compact"/>
-              <w:jc w:val="left"/>
-            </w:pPr>
-            <w:r>
-              <w:t xml:space="preserve">Index Richesse ACP (Écart-Type)</w:t>
-            </w:r>
-          </w:p>
-        </w:tc>
-        <w:tc>
-          <w:tcPr/>
-          <w:p>
-            <w:pPr>
-              <w:pStyle w:val="Compact"/>
-              <w:jc w:val="left"/>
-            </w:pPr>
-            <w:r>
-              <w:t xml:space="preserve">1.62</w:t>
-            </w:r>
-          </w:p>
-        </w:tc>
-      </w:tr>
-      <w:tr>
-        <w:tc>
-          <w:tcPr/>
-          <w:p>
-            <w:pPr>
-              <w:pStyle w:val="Compact"/>
-              <w:jc w:val="left"/>
-            </w:pPr>
-            <w:r>
-              <w:t xml:space="preserve">Nombre moyen de pièces</w:t>
-            </w:r>
-          </w:p>
-        </w:tc>
-        <w:tc>
-          <w:tcPr/>
-          <w:p>
-            <w:pPr>
-              <w:pStyle w:val="Compact"/>
-              <w:jc w:val="left"/>
-            </w:pPr>
-            <w:r>
-              <w:t xml:space="preserve">4.81</w:t>
-            </w:r>
-          </w:p>
-        </w:tc>
-      </w:tr>
-      <w:tr>
-        <w:tc>
-          <w:tcPr/>
-          <w:p>
-            <w:pPr>
-              <w:pStyle w:val="Compact"/>
-              <w:jc w:val="left"/>
-            </w:pPr>
-            <w:r>
-              <w:t xml:space="preserve">Valeurs aberrantes détectées (Nb pièces)</w:t>
-            </w:r>
-          </w:p>
-        </w:tc>
-        <w:tc>
-          <w:tcPr/>
-          <w:p>
-            <w:pPr>
-              <w:pStyle w:val="Compact"/>
-              <w:jc w:val="left"/>
-            </w:pPr>
-            <w:r>
-              <w:t xml:space="preserve">61</w:t>
-            </w:r>
-          </w:p>
-        </w:tc>
-      </w:tr>
-    </w:tbl>
-    <w:p>
-      <w:pPr>
-        <w:pStyle w:val="BodyText"/>
-      </w:pPr>
-      <w:r>
-        <w:drawing>
-          <wp:inline>
-            <wp:extent cx="5334000" cy="3333750"/>
-            <wp:effectExtent b="0" l="0" r="0" t="0"/>
-            <wp:docPr descr="" title="" id="63" name="Picture"/>
-            <a:graphic>
-              <a:graphicData uri="http://schemas.openxmlformats.org/drawingml/2006/picture">
-                <pic:pic>
-                  <pic:nvPicPr>
-                    <pic:cNvPr descr="C:\Users\USER\Documents\ENSAE\ISE3\traitements des données statistiques\Projet_Traitement_Analyse\PUDC_Pipeline\data\output\QAQC_Report_files/5ca01081c8260c46e7786567e173f353f553a349.png" id="64" name="Picture"/>
-                    <pic:cNvPicPr>
-                      <a:picLocks noChangeArrowheads="1" noChangeAspect="1"/>
-                    </pic:cNvPicPr>
-                  </pic:nvPicPr>
-                  <pic:blipFill>
-                    <a:blip r:embed="rId62"/>
-                    <a:stretch>
-                      <a:fillRect/>
-                    </a:stretch>
-                  </pic:blipFill>
-                  <pic:spPr bwMode="auto">
-                    <a:xfrm>
-                      <a:off x="0" y="0"/>
-                      <a:ext cx="5334000" cy="3333750"/>
-                    </a:xfrm>
-                    <a:prstGeom prst="rect">
-                      <a:avLst/>
-                    </a:prstGeom>
-                    <a:noFill/>
-                    <a:ln w="9525">
-                      <a:noFill/>
-                      <a:headEnd/>
-                      <a:tailEnd/>
-                    </a:ln>
-                  </pic:spPr>
-                </pic:pic>
-              </a:graphicData>
-            </a:graphic>
-          </wp:inline>
-        </w:drawing>
-      </w:r>
-    </w:p>
-    <w:bookmarkStart w:id="68" w:name="X26c73b2bb45f2938bec17c26bc766d18289964b"/>
-    <w:p>
-      <w:pPr>
-        <w:pStyle w:val="Heading4"/>
-      </w:pPr>
-      <w:r>
-        <w:t xml:space="preserve">Relation bivariée : Taille du ménage vs Score ACP (Cours 3)</w:t>
-      </w:r>
-    </w:p>
-    <w:p>
-      <w:pPr>
-        <w:pStyle w:val="FirstParagraph"/>
-      </w:pPr>
-      <w:r>
-        <w:drawing>
-          <wp:inline>
-            <wp:extent cx="5334000" cy="3556000"/>
-            <wp:effectExtent b="0" l="0" r="0" t="0"/>
-            <wp:docPr descr="" title="" id="66" name="Picture"/>
-            <a:graphic>
-              <a:graphicData uri="http://schemas.openxmlformats.org/drawingml/2006/picture">
-                <pic:pic>
-                  <pic:nvPicPr>
-                    <pic:cNvPr descr="C:\Users\USER\Documents\ENSAE\ISE3\traitements des données statistiques\Projet_Traitement_Analyse\PUDC_Pipeline\data\output\QAQC_Report_files/19f33580f487a7471ea76a519f65fe400a0ddf90.png" id="67" name="Picture"/>
-                    <pic:cNvPicPr>
-                      <a:picLocks noChangeArrowheads="1" noChangeAspect="1"/>
-                    </pic:cNvPicPr>
-                  </pic:nvPicPr>
-                  <pic:blipFill>
-                    <a:blip r:embed="rId65"/>
-                    <a:stretch>
-                      <a:fillRect/>
-                    </a:stretch>
-                  </pic:blipFill>
-                  <pic:spPr bwMode="auto">
-                    <a:xfrm>
-                      <a:off x="0" y="0"/>
-                      <a:ext cx="5334000" cy="3556000"/>
-                    </a:xfrm>
-                    <a:prstGeom prst="rect">
-                      <a:avLst/>
-                    </a:prstGeom>
-                    <a:noFill/>
-                    <a:ln w="9525">
-                      <a:noFill/>
-                      <a:headEnd/>
-                      <a:tailEnd/>
-                    </a:ln>
-                  </pic:spPr>
-                </pic:pic>
-              </a:graphicData>
-            </a:graphic>
-          </wp:inline>
-        </w:drawing>
-      </w:r>
-    </w:p>
-    <w:bookmarkEnd w:id="68"/>
-    <w:bookmarkEnd w:id="69"/>
-    <w:bookmarkStart w:id="73" w:name="quintiles-de-richesse-méthode-dhs"/>
-    <w:p>
-      <w:pPr>
-        <w:pStyle w:val="Heading3"/>
-      </w:pPr>
-      <w:r>
-        <w:t xml:space="preserve">Quintiles de richesse (méthode DHS)</w:t>
-      </w:r>
-    </w:p>
-    <w:p>
-      <w:pPr>
-        <w:pStyle w:val="FirstParagraph"/>
-      </w:pPr>
-      <w:r>
-        <w:t xml:space="preserve">Les quintiles sont calculés à l’intérieur de chaque milieu (Rural/Urbain) afin de ne pas confondre richesse et milieu.</w:t>
-      </w:r>
-    </w:p>
-    <w:p>
-      <w:pPr>
-        <w:pStyle w:val="BodyText"/>
       </w:pPr>
       <w:r>
         <w:drawing>
@@ -4735,7 +4667,7 @@
               <a:graphicData uri="http://schemas.openxmlformats.org/drawingml/2006/picture">
                 <pic:pic>
                   <pic:nvPicPr>
-                    <pic:cNvPr descr="C:\Users\USER\Documents\ENSAE\ISE3\traitements des données statistiques\Projet_Traitement_Analyse\PUDC_Pipeline\data\output\QAQC_Report_files/f8e3524797c3360f60b64071212e429b3f55ae4c.png" id="72" name="Picture"/>
+                    <pic:cNvPr descr="C:\Users\USER\Documents\ENSAE\ISE3\traitements des données statistiques\Projet_Traitement_Analyse\PUDC_Pipeline\data\output\QAQC_Report_files/f977eb1bcefc3c09c373fbf63f3e3afa91e82e1f.png" id="72" name="Picture"/>
                     <pic:cNvPicPr>
                       <a:picLocks noChangeArrowheads="1" noChangeAspect="1"/>
                     </pic:cNvPicPr>
@@ -4769,65 +4701,8 @@
       </w:r>
     </w:p>
     <w:bookmarkEnd w:id="73"/>
-    <w:bookmarkStart w:id="77" w:name="index-de-richesse-par-région"/>
-    <w:p>
-      <w:pPr>
-        <w:pStyle w:val="Heading3"/>
-      </w:pPr>
-      <w:r>
-        <w:t xml:space="preserve">Index de richesse par région</w:t>
-      </w:r>
-    </w:p>
-    <w:p>
-      <w:pPr>
-        <w:pStyle w:val="FirstParagraph"/>
-      </w:pPr>
-      <w:r>
-        <w:drawing>
-          <wp:inline>
-            <wp:extent cx="5334000" cy="3333750"/>
-            <wp:effectExtent b="0" l="0" r="0" t="0"/>
-            <wp:docPr descr="" title="" id="75" name="Picture"/>
-            <a:graphic>
-              <a:graphicData uri="http://schemas.openxmlformats.org/drawingml/2006/picture">
-                <pic:pic>
-                  <pic:nvPicPr>
-                    <pic:cNvPr descr="C:\Users\USER\Documents\ENSAE\ISE3\traitements des données statistiques\Projet_Traitement_Analyse\PUDC_Pipeline\data\output\QAQC_Report_files/a5e929b394dc1925d435ad5ad3f139d8136b6ef2.png" id="76" name="Picture"/>
-                    <pic:cNvPicPr>
-                      <a:picLocks noChangeArrowheads="1" noChangeAspect="1"/>
-                    </pic:cNvPicPr>
-                  </pic:nvPicPr>
-                  <pic:blipFill>
-                    <a:blip r:embed="rId74"/>
-                    <a:stretch>
-                      <a:fillRect/>
-                    </a:stretch>
-                  </pic:blipFill>
-                  <pic:spPr bwMode="auto">
-                    <a:xfrm>
-                      <a:off x="0" y="0"/>
-                      <a:ext cx="5334000" cy="3333750"/>
-                    </a:xfrm>
-                    <a:prstGeom prst="rect">
-                      <a:avLst/>
-                    </a:prstGeom>
-                    <a:noFill/>
-                    <a:ln w="9525">
-                      <a:noFill/>
-                      <a:headEnd/>
-                      <a:tailEnd/>
-                    </a:ln>
-                  </pic:spPr>
-                </pic:pic>
-              </a:graphicData>
-            </a:graphic>
-          </wp:inline>
-        </w:drawing>
-      </w:r>
-    </w:p>
-    <w:bookmarkEnd w:id="77"/>
-    <w:bookmarkEnd w:id="78"/>
-    <w:bookmarkStart w:id="81" w:name="chocs-vulnérabilité-et-malnutrition"/>
+    <w:bookmarkEnd w:id="74"/>
+    <w:bookmarkStart w:id="77" w:name="chocs-vulnérabilité-et-malnutrition"/>
     <w:p>
       <w:pPr>
         <w:pStyle w:val="Heading2"/>
@@ -4836,7 +4711,7 @@
         <w:t xml:space="preserve">5. Chocs, Vulnérabilité et Malnutrition</w:t>
       </w:r>
     </w:p>
-    <w:bookmarkStart w:id="79" w:name="chocs-subis"/>
+    <w:bookmarkStart w:id="75" w:name="chocs-subis"/>
     <w:p>
       <w:pPr>
         <w:pStyle w:val="Heading3"/>
@@ -4946,8 +4821,8 @@
         </w:tc>
       </w:tr>
     </w:tbl>
-    <w:bookmarkEnd w:id="79"/>
-    <w:bookmarkStart w:id="80" w:name="X3d937f72fd8699be37f5c52e516288e3126d0d8"/>
+    <w:bookmarkEnd w:id="75"/>
+    <w:bookmarkStart w:id="76" w:name="X3d937f72fd8699be37f5c52e516288e3126d0d8"/>
     <w:p>
       <w:pPr>
         <w:pStyle w:val="Heading3"/>
@@ -4961,7 +4836,20 @@
         <w:pStyle w:val="FirstParagraph"/>
       </w:pPr>
       <w:r>
-        <w:t xml:space="preserve">L’indicateur de malnutrition a été calculé en se basant uniquement sur la tranche d’âge cible (6-59 mois) avec des mesures valides du Périmètre Brachial (MUAC).</w:t>
+        <w:t xml:space="preserve">L’indicateur de malnutrition a été calculé sur la tranche d’âge cible (6-59 mois) ; comme le Périmètre Brachial (MUAC) est absent à 100 % de la collecte, il repose</w:t>
+      </w:r>
+      <w:r>
+        <w:t xml:space="preserve"> </w:t>
+      </w:r>
+      <w:r>
+        <w:rPr>
+          <w:b/>
+          <w:bCs/>
+        </w:rPr>
+        <w:t xml:space="preserve">uniquement sur la déclaration d’œdèmes</w:t>
+      </w:r>
+      <w:r>
+        <w:t xml:space="preserve">.</w:t>
       </w:r>
     </w:p>
     <w:p>
@@ -5109,9 +4997,9 @@
         </w:pict>
       </w:r>
     </w:p>
-    <w:bookmarkEnd w:id="80"/>
-    <w:bookmarkEnd w:id="81"/>
-    <w:bookmarkStart w:id="82" w:name="X9cbc303703b8faff10a019fc595feee046fb4b4"/>
+    <w:bookmarkEnd w:id="76"/>
+    <w:bookmarkEnd w:id="77"/>
+    <w:bookmarkStart w:id="78" w:name="X9cbc303703b8faff10a019fc595feee046fb4b4"/>
     <w:p>
       <w:pPr>
         <w:pStyle w:val="Heading2"/>
@@ -5422,8 +5310,8 @@
         <w:t xml:space="preserve">et répéter les estimations pondérées (voir template EHCVM de référence).</w:t>
       </w:r>
     </w:p>
-    <w:bookmarkEnd w:id="82"/>
-    <w:bookmarkStart w:id="83" w:name="conclusion"/>
+    <w:bookmarkEnd w:id="78"/>
+    <w:bookmarkStart w:id="79" w:name="conclusion"/>
     <w:p>
       <w:pPr>
         <w:pStyle w:val="Heading2"/>
@@ -5470,7 +5358,7 @@
         <w:t xml:space="preserve">sont désormais structurées, exemptes d’aberrations majeures, et prêtes pour des modélisations statistiques avancées.</w:t>
       </w:r>
     </w:p>
-    <w:bookmarkEnd w:id="83"/>
+    <w:bookmarkEnd w:id="79"/>
     <w:sectPr>
       <w:footnotePr>
         <w:numRestart w:val="eachSect"/>
@@ -5581,8 +5469,114 @@
       </w:pPr>
     </w:lvl>
   </w:abstractNum>
+  <w:abstractNum w:abstractNumId="991">
+    <w:nsid w:val="0000A991"/>
+    <w:multiLevelType w:val="multilevel"/>
+    <w:lvl w:ilvl="0">
+      <w:numFmt w:val="bullet"/>
+      <w:lvlText w:val=""/>
+      <w:lvlJc w:val="left"/>
+      <w:pPr>
+        <w:ind w:left="720" w:hanging="360"/>
+      </w:pPr>
+      <w:rPr>
+        <w:rFonts w:ascii="Symbol" w:hAnsi="Symbol" w:cs="Symbol" w:hint="default"/>
+      </w:rPr>
+    </w:lvl>
+    <w:lvl w:ilvl="1">
+      <w:numFmt w:val="bullet"/>
+      <w:lvlText w:val="o"/>
+      <w:lvlJc w:val="left"/>
+      <w:pPr>
+        <w:ind w:left="1440" w:hanging="360"/>
+      </w:pPr>
+      <w:rPr>
+        <w:rFonts w:ascii="Courier New" w:hAnsi="Courier New" w:cs="Courier New" w:hint="default"/>
+      </w:rPr>
+    </w:lvl>
+    <w:lvl w:ilvl="2">
+      <w:numFmt w:val="bullet"/>
+      <w:lvlText w:val=""/>
+      <w:lvlJc w:val="left"/>
+      <w:pPr>
+        <w:ind w:left="2160" w:hanging="360"/>
+      </w:pPr>
+      <w:rPr>
+        <w:rFonts w:ascii="Wingdings" w:hAnsi="Wingdings" w:cs="Wingdings" w:hint="default"/>
+      </w:rPr>
+    </w:lvl>
+    <w:lvl w:ilvl="3">
+      <w:numFmt w:val="bullet"/>
+      <w:lvlText w:val=""/>
+      <w:lvlJc w:val="left"/>
+      <w:pPr>
+        <w:ind w:left="2880" w:hanging="360"/>
+      </w:pPr>
+      <w:rPr>
+        <w:rFonts w:ascii="Symbol" w:hAnsi="Symbol" w:cs="Symbol" w:hint="default"/>
+      </w:rPr>
+    </w:lvl>
+    <w:lvl w:ilvl="4">
+      <w:numFmt w:val="bullet"/>
+      <w:lvlText w:val="o"/>
+      <w:lvlJc w:val="left"/>
+      <w:pPr>
+        <w:ind w:left="3600" w:hanging="360"/>
+      </w:pPr>
+      <w:rPr>
+        <w:rFonts w:ascii="Courier New" w:hAnsi="Courier New" w:cs="Courier New" w:hint="default"/>
+      </w:rPr>
+    </w:lvl>
+    <w:lvl w:ilvl="5">
+      <w:numFmt w:val="bullet"/>
+      <w:lvlText w:val=""/>
+      <w:lvlJc w:val="left"/>
+      <w:pPr>
+        <w:ind w:left="4320" w:hanging="360"/>
+      </w:pPr>
+      <w:rPr>
+        <w:rFonts w:ascii="Wingdings" w:hAnsi="Wingdings" w:cs="Wingdings" w:hint="default"/>
+      </w:rPr>
+    </w:lvl>
+    <w:lvl w:ilvl="6">
+      <w:numFmt w:val="bullet"/>
+      <w:lvlText w:val=""/>
+      <w:lvlJc w:val="left"/>
+      <w:pPr>
+        <w:ind w:left="5040" w:hanging="360"/>
+      </w:pPr>
+      <w:rPr>
+        <w:rFonts w:ascii="Symbol" w:hAnsi="Symbol" w:cs="Symbol" w:hint="default"/>
+      </w:rPr>
+    </w:lvl>
+    <w:lvl w:ilvl="7">
+      <w:numFmt w:val="bullet"/>
+      <w:lvlText w:val="o"/>
+      <w:lvlJc w:val="left"/>
+      <w:pPr>
+        <w:ind w:left="5760" w:hanging="360"/>
+      </w:pPr>
+      <w:rPr>
+        <w:rFonts w:ascii="Courier New" w:hAnsi="Courier New" w:cs="Courier New" w:hint="default"/>
+      </w:rPr>
+    </w:lvl>
+    <w:lvl w:ilvl="8">
+      <w:numFmt w:val="bullet"/>
+      <w:lvlText w:val=""/>
+      <w:lvlJc w:val="left"/>
+      <w:pPr>
+        <w:ind w:left="6480" w:hanging="360"/>
+      </w:pPr>
+      <w:rPr>
+        <w:rFonts w:ascii="Wingdings" w:hAnsi="Wingdings" w:cs="Wingdings" w:hint="default"/>
+      </w:rPr>
+    </w:lvl>
+  </w:abstractNum>
   <w:num w:numId="1000">
     <w:abstractNumId w:val="990"/>
+  </w:num>
+  <w:num w:numId="1001">
+    <w:abstractNumId w:val="991"/>
   </w:num>
 </w:numbering>
 </file>

</xml_diff>